<commit_message>
Make RESET a common signal
Add RESET to 3.4 PC CTRL bus and 3.1 Common bus signals
</commit_message>
<xml_diff>
--- a/CPU Design/CpuDesign.docx
+++ b/CPU Design/CpuDesign.docx
@@ -1771,6 +1771,220 @@
               </w:p>
             </w:tc>
           </w:tr>
+          <w:tr>
+            <w:tc>
+              <w:tcPr>
+                <w:tcW w:w="1384" w:type="dxa"/>
+              </w:tcPr>
+              <w:p>
+                <w:pPr>
+                  <w:rPr>
+                    <w:rFonts w:cstheme="minorHAnsi"/>
+                  </w:rPr>
+                </w:pPr>
+                <w:r>
+                  <w:rPr>
+                    <w:rFonts w:cstheme="minorHAnsi"/>
+                  </w:rPr>
+                  <w:t>2 Jul 2026</w:t>
+                </w:r>
+              </w:p>
+            </w:tc>
+            <w:tc>
+              <w:tcPr>
+                <w:tcW w:w="7858" w:type="dxa"/>
+              </w:tcPr>
+              <w:p>
+                <w:pPr>
+                  <w:rPr>
+                    <w:rFonts w:cstheme="minorHAnsi"/>
+                  </w:rPr>
+                </w:pPr>
+                <w:r>
+                  <w:rPr>
+                    <w:rFonts w:cstheme="minorHAnsi"/>
+                  </w:rPr>
+                  <w:t xml:space="preserve">Add RESET to </w:t>
+                </w:r>
+                <w:r>
+                  <w:rPr>
+                    <w:rFonts w:cstheme="minorHAnsi"/>
+                  </w:rPr>
+                  <w:fldChar w:fldCharType="begin"/>
+                </w:r>
+                <w:r>
+                  <w:rPr>
+                    <w:rFonts w:cstheme="minorHAnsi"/>
+                  </w:rPr>
+                  <w:instrText xml:space="preserve"> REF _Ref233021496 \r \h </w:instrText>
+                </w:r>
+                <w:r>
+                  <w:rPr>
+                    <w:rFonts w:cstheme="minorHAnsi"/>
+                  </w:rPr>
+                </w:r>
+                <w:r>
+                  <w:rPr>
+                    <w:rFonts w:cstheme="minorHAnsi"/>
+                  </w:rPr>
+                  <w:fldChar w:fldCharType="separate"/>
+                </w:r>
+                <w:r>
+                  <w:rPr>
+                    <w:rFonts w:cstheme="minorHAnsi"/>
+                  </w:rPr>
+                  <w:t>3.4</w:t>
+                </w:r>
+                <w:r>
+                  <w:rPr>
+                    <w:rFonts w:cstheme="minorHAnsi"/>
+                  </w:rPr>
+                  <w:fldChar w:fldCharType="end"/>
+                </w:r>
+                <w:r>
+                  <w:rPr>
+                    <w:rFonts w:cstheme="minorHAnsi"/>
+                  </w:rPr>
+                  <w:t xml:space="preserve"> </w:t>
+                </w:r>
+                <w:r>
+                  <w:rPr>
+                    <w:rFonts w:cstheme="minorHAnsi"/>
+                  </w:rPr>
+                  <w:fldChar w:fldCharType="begin"/>
+                </w:r>
+                <w:r>
+                  <w:rPr>
+                    <w:rFonts w:cstheme="minorHAnsi"/>
+                  </w:rPr>
+                  <w:instrText xml:space="preserve"> REF _Ref233021496 \h </w:instrText>
+                </w:r>
+                <w:r>
+                  <w:rPr>
+                    <w:rFonts w:cstheme="minorHAnsi"/>
+                  </w:rPr>
+                </w:r>
+                <w:r>
+                  <w:rPr>
+                    <w:rFonts w:cstheme="minorHAnsi"/>
+                  </w:rPr>
+                  <w:fldChar w:fldCharType="separate"/>
+                </w:r>
+                <w:r>
+                  <w:rPr>
+                    <w:lang w:eastAsia="en-GB"/>
+                  </w:rPr>
+                  <w:t>PC CT</w:t>
+                </w:r>
+                <w:r>
+                  <w:rPr>
+                    <w:lang w:eastAsia="en-GB"/>
+                  </w:rPr>
+                  <w:t>R</w:t>
+                </w:r>
+                <w:r>
+                  <w:rPr>
+                    <w:lang w:eastAsia="en-GB"/>
+                  </w:rPr>
+                  <w:t>L</w:t>
+                </w:r>
+                <w:r>
+                  <w:rPr>
+                    <w:lang w:eastAsia="en-GB"/>
+                  </w:rPr>
+                  <w:t xml:space="preserve"> bus</w:t>
+                </w:r>
+                <w:r>
+                  <w:rPr>
+                    <w:rFonts w:cstheme="minorHAnsi"/>
+                  </w:rPr>
+                  <w:fldChar w:fldCharType="end"/>
+                </w:r>
+                <w:r>
+                  <w:rPr>
+                    <w:rFonts w:cstheme="minorHAnsi"/>
+                  </w:rPr>
+                  <w:t xml:space="preserve"> and </w:t>
+                </w:r>
+                <w:r>
+                  <w:rPr>
+                    <w:rFonts w:cstheme="minorHAnsi"/>
+                  </w:rPr>
+                  <w:fldChar w:fldCharType="begin"/>
+                </w:r>
+                <w:r>
+                  <w:rPr>
+                    <w:rFonts w:cstheme="minorHAnsi"/>
+                  </w:rPr>
+                  <w:instrText xml:space="preserve"> REF _Ref232084668 \r \h </w:instrText>
+                </w:r>
+                <w:r>
+                  <w:rPr>
+                    <w:rFonts w:cstheme="minorHAnsi"/>
+                  </w:rPr>
+                </w:r>
+                <w:r>
+                  <w:rPr>
+                    <w:rFonts w:cstheme="minorHAnsi"/>
+                  </w:rPr>
+                  <w:fldChar w:fldCharType="separate"/>
+                </w:r>
+                <w:r>
+                  <w:rPr>
+                    <w:rFonts w:cstheme="minorHAnsi"/>
+                  </w:rPr>
+                  <w:t>3.1</w:t>
+                </w:r>
+                <w:r>
+                  <w:rPr>
+                    <w:rFonts w:cstheme="minorHAnsi"/>
+                  </w:rPr>
+                  <w:fldChar w:fldCharType="end"/>
+                </w:r>
+                <w:r>
+                  <w:rPr>
+                    <w:rFonts w:cstheme="minorHAnsi"/>
+                  </w:rPr>
+                  <w:t xml:space="preserve"> </w:t>
+                </w:r>
+                <w:r>
+                  <w:rPr>
+                    <w:rFonts w:cstheme="minorHAnsi"/>
+                  </w:rPr>
+                  <w:fldChar w:fldCharType="begin"/>
+                </w:r>
+                <w:r>
+                  <w:rPr>
+                    <w:rFonts w:cstheme="minorHAnsi"/>
+                  </w:rPr>
+                  <w:instrText xml:space="preserve"> REF _Ref232084668 \h </w:instrText>
+                </w:r>
+                <w:r>
+                  <w:rPr>
+                    <w:rFonts w:cstheme="minorHAnsi"/>
+                  </w:rPr>
+                </w:r>
+                <w:r>
+                  <w:rPr>
+                    <w:rFonts w:cstheme="minorHAnsi"/>
+                  </w:rPr>
+                  <w:fldChar w:fldCharType="separate"/>
+                </w:r>
+                <w:r>
+                  <w:rPr>
+                    <w:lang w:eastAsia="en-GB"/>
+                  </w:rPr>
+                  <w:t>Common bus signals</w:t>
+                </w:r>
+                <w:r>
+                  <w:rPr>
+                    <w:rFonts w:cstheme="minorHAnsi"/>
+                  </w:rPr>
+                  <w:fldChar w:fldCharType="end"/>
+                </w:r>
+              </w:p>
+            </w:tc>
+          </w:tr>
         </w:tbl>
         <w:p>
           <w:pPr>
@@ -5775,15 +5989,15 @@
           <w:lang w:eastAsia="en-GB"/>
         </w:rPr>
       </w:pPr>
-      <w:bookmarkStart w:id="23" w:name="_Ref172648415"/>
-      <w:bookmarkStart w:id="24" w:name="_Toc233722268"/>
+      <w:bookmarkStart w:id="23" w:name="_Toc233722268"/>
+      <w:bookmarkStart w:id="24" w:name="_Ref172648415"/>
       <w:r>
         <w:rPr>
           <w:lang w:eastAsia="en-GB"/>
         </w:rPr>
         <w:t>Other Busses</w:t>
       </w:r>
-      <w:bookmarkEnd w:id="24"/>
+      <w:bookmarkEnd w:id="23"/>
     </w:p>
     <w:p>
       <w:pPr>
@@ -6575,6 +6789,48 @@
     </w:p>
     <w:p>
       <w:pPr>
+        <w:pStyle w:val="ListParagraph"/>
+        <w:numPr>
+          <w:ilvl w:val="0"/>
+          <w:numId w:val="5"/>
+        </w:numPr>
+        <w:rPr>
+          <w:lang w:eastAsia="en-GB"/>
+        </w:rPr>
+      </w:pPr>
+      <w:r>
+        <w:rPr>
+          <w:lang w:eastAsia="en-GB"/>
+        </w:rPr>
+        <w:t>RESET</w:t>
+      </w:r>
+    </w:p>
+    <w:p>
+      <w:pPr>
+        <w:pStyle w:val="ListParagraph"/>
+        <w:numPr>
+          <w:ilvl w:val="1"/>
+          <w:numId w:val="5"/>
+        </w:numPr>
+        <w:rPr>
+          <w:lang w:eastAsia="en-GB"/>
+        </w:rPr>
+      </w:pPr>
+      <w:r>
+        <w:rPr>
+          <w:lang w:eastAsia="en-GB"/>
+        </w:rPr>
+        <w:t>Starts high at power up, then changes to low after some time T on the rising edge of a CLOCK.</w:t>
+      </w:r>
+      <w:r>
+        <w:rPr>
+          <w:lang w:eastAsia="en-GB"/>
+        </w:rPr>
+        <w:t xml:space="preserve"> T must be at least 2 clock periods. It may be much longer than that.</w:t>
+      </w:r>
+    </w:p>
+    <w:p>
+      <w:pPr>
         <w:pStyle w:val="Heading2"/>
         <w:rPr>
           <w:lang w:eastAsia="en-GB"/>
@@ -6617,6 +6873,7 @@
         <w:rPr>
           <w:lang w:eastAsia="en-GB"/>
         </w:rPr>
+        <w:lastRenderedPageBreak/>
         <w:t>OP CODE bus</w:t>
       </w:r>
       <w:bookmarkEnd w:id="32"/>
@@ -6649,7 +6906,6 @@
         <w:rPr>
           <w:lang w:eastAsia="en-GB"/>
         </w:rPr>
-        <w:lastRenderedPageBreak/>
         <w:t>PC CTRL bus</w:t>
       </w:r>
       <w:bookmarkEnd w:id="34"/>
@@ -6803,6 +7059,95 @@
           <w:lang w:eastAsia="en-GB"/>
         </w:rPr>
         <w:t>)</w:t>
+      </w:r>
+    </w:p>
+    <w:p>
+      <w:pPr>
+        <w:pStyle w:val="ListParagraph"/>
+        <w:numPr>
+          <w:ilvl w:val="0"/>
+          <w:numId w:val="6"/>
+        </w:numPr>
+        <w:rPr>
+          <w:lang w:eastAsia="en-GB"/>
+        </w:rPr>
+      </w:pPr>
+      <w:r>
+        <w:rPr>
+          <w:lang w:eastAsia="en-GB"/>
+        </w:rPr>
+        <w:t xml:space="preserve">RESET (common defined in </w:t>
+      </w:r>
+      <w:r>
+        <w:rPr>
+          <w:lang w:eastAsia="en-GB"/>
+        </w:rPr>
+        <w:fldChar w:fldCharType="begin"/>
+      </w:r>
+      <w:r>
+        <w:rPr>
+          <w:lang w:eastAsia="en-GB"/>
+        </w:rPr>
+        <w:instrText xml:space="preserve"> REF _Ref232084668 \r \h </w:instrText>
+      </w:r>
+      <w:r>
+        <w:rPr>
+          <w:lang w:eastAsia="en-GB"/>
+        </w:rPr>
+      </w:r>
+      <w:r>
+        <w:rPr>
+          <w:lang w:eastAsia="en-GB"/>
+        </w:rPr>
+        <w:fldChar w:fldCharType="separate"/>
+      </w:r>
+      <w:r>
+        <w:rPr>
+          <w:lang w:eastAsia="en-GB"/>
+        </w:rPr>
+        <w:t>3</w:t>
+      </w:r>
+      <w:r>
+        <w:rPr>
+          <w:lang w:eastAsia="en-GB"/>
+        </w:rPr>
+        <w:t>.</w:t>
+      </w:r>
+      <w:r>
+        <w:rPr>
+          <w:lang w:eastAsia="en-GB"/>
+        </w:rPr>
+        <w:t>1</w:t>
+      </w:r>
+      <w:r>
+        <w:rPr>
+          <w:lang w:eastAsia="en-GB"/>
+        </w:rPr>
+        <w:fldChar w:fldCharType="end"/>
+      </w:r>
+      <w:r>
+        <w:rPr>
+          <w:lang w:eastAsia="en-GB"/>
+        </w:rPr>
+        <w:t>)</w:t>
+      </w:r>
+    </w:p>
+    <w:p>
+      <w:pPr>
+        <w:pStyle w:val="ListParagraph"/>
+        <w:numPr>
+          <w:ilvl w:val="1"/>
+          <w:numId w:val="6"/>
+        </w:numPr>
+        <w:rPr>
+          <w:lang w:eastAsia="en-GB"/>
+        </w:rPr>
+      </w:pPr>
+      <w:r>
+        <w:rPr>
+          <w:lang w:eastAsia="en-GB"/>
+        </w:rPr>
+        <w:t>Resets the PC to 0x0000.</w:t>
       </w:r>
     </w:p>
     <w:p>
@@ -11921,7 +12266,7 @@
         <w:lastRenderedPageBreak/>
         <w:t>References</w:t>
       </w:r>
-      <w:bookmarkEnd w:id="23"/>
+      <w:bookmarkEnd w:id="24"/>
       <w:bookmarkEnd w:id="64"/>
     </w:p>
     <w:bookmarkStart w:id="65" w:name="AVR_Instruction_Doc"/>
@@ -11947,11 +12292,6 @@
           <w:lang w:eastAsia="en-GB"/>
         </w:rPr>
         <w:instrText xml:space="preserve"> HYPERLINK "https://ww1.microchip.com/downloads/en/DeviceDoc/AVR-InstructionSet-Manual-DS40002198.pdf" </w:instrText>
-      </w:r>
-      <w:r>
-        <w:rPr>
-          <w:lang w:eastAsia="en-GB"/>
-        </w:rPr>
       </w:r>
       <w:r>
         <w:rPr>
@@ -12091,7 +12431,7 @@
               <w:b/>
               <w:noProof/>
             </w:rPr>
-            <w:t>8</w:t>
+            <w:t>5</w:t>
           </w:r>
         </w:fldSimple>
       </w:p>
@@ -14809,7 +15149,7 @@
         <w:rFonts w:ascii="Symbol" w:hAnsi="Symbol" w:hint="default"/>
       </w:rPr>
     </w:lvl>
-    <w:lvl w:ilvl="1" w:tplc="08090003" w:tentative="1">
+    <w:lvl w:ilvl="1" w:tplc="08090003">
       <w:start w:val="1"/>
       <w:numFmt w:val="bullet"/>
       <w:lvlText w:val="o"/>
@@ -16584,7 +16924,7 @@
 </file>
 
 <file path=customXml/itemProps2.xml><?xml version="1.0" encoding="utf-8"?>
-<ds:datastoreItem xmlns:ds="http://schemas.openxmlformats.org/officeDocument/2006/customXml" ds:itemID="{6EE60FA8-F6FA-4FE3-A471-DF351C45A0BF}">
+<ds:datastoreItem xmlns:ds="http://schemas.openxmlformats.org/officeDocument/2006/customXml" ds:itemID="{E7A8A3C7-E53F-4F86-9DF3-E5B2A88B014A}">
   <ds:schemaRefs>
     <ds:schemaRef ds:uri="http://schemas.openxmlformats.org/officeDocument/2006/bibliography"/>
   </ds:schemaRefs>

</xml_diff>

<commit_message>
Change signals from active high to active low
All the signals in L1IsSequences.xlsx, except INC_PC have been changed so that the red cells are L and the green cells are H.
Also had to change L1IsDesign.docx, L1IsDrawings.pptx, CpuDesign.docx and L1AluDesign.docx
</commit_message>
<xml_diff>
--- a/CPU Design/CpuDesign.docx
+++ b/CPU Design/CpuDesign.docx
@@ -63,7 +63,7 @@
                     <v:path arrowok="t"/>
                   </v:shape>
                 </v:group>
-                <v:rect id="_x0000_s1039" style="position:absolute;left:1800;top:1440;width:8638;height:551;mso-width-percent:1000;mso-position-horizontal:center;mso-position-horizontal-relative:margin;mso-position-vertical:top;mso-position-vertical-relative:margin;mso-width-percent:1000;mso-width-relative:margin;mso-height-relative:margin" filled="f" stroked="f">
+                <v:rect id="_x0000_s1039" style="position:absolute;left:1800;top:1440;width:8638;height:736;mso-width-percent:1000;mso-position-horizontal:center;mso-position-horizontal-relative:margin;mso-position-vertical:top;mso-position-vertical-relative:margin;mso-width-percent:1000;mso-width-relative:margin;mso-height-relative:margin" filled="f" stroked="f">
                   <v:textbox style="mso-next-textbox:#_x0000_s1039;mso-fit-shape-to-text:t">
                     <w:txbxContent>
                       <w:p>
@@ -1874,25 +1874,89 @@
                   <w:rPr>
                     <w:lang w:eastAsia="en-GB"/>
                   </w:rPr>
-                  <w:t>PC CT</w:t>
+                  <w:t>PC CTRL bus</w:t>
+                </w:r>
+                <w:r>
+                  <w:rPr>
+                    <w:rFonts w:cstheme="minorHAnsi"/>
+                  </w:rPr>
+                  <w:fldChar w:fldCharType="end"/>
+                </w:r>
+                <w:r>
+                  <w:rPr>
+                    <w:rFonts w:cstheme="minorHAnsi"/>
+                  </w:rPr>
+                  <w:t xml:space="preserve"> and </w:t>
+                </w:r>
+                <w:r>
+                  <w:rPr>
+                    <w:rFonts w:cstheme="minorHAnsi"/>
+                  </w:rPr>
+                  <w:fldChar w:fldCharType="begin"/>
+                </w:r>
+                <w:r>
+                  <w:rPr>
+                    <w:rFonts w:cstheme="minorHAnsi"/>
+                  </w:rPr>
+                  <w:instrText xml:space="preserve"> REF _Ref232084668 \r \h </w:instrText>
+                </w:r>
+                <w:r>
+                  <w:rPr>
+                    <w:rFonts w:cstheme="minorHAnsi"/>
+                  </w:rPr>
+                </w:r>
+                <w:r>
+                  <w:rPr>
+                    <w:rFonts w:cstheme="minorHAnsi"/>
+                  </w:rPr>
+                  <w:fldChar w:fldCharType="separate"/>
+                </w:r>
+                <w:r>
+                  <w:rPr>
+                    <w:rFonts w:cstheme="minorHAnsi"/>
+                  </w:rPr>
+                  <w:t>3.1</w:t>
+                </w:r>
+                <w:r>
+                  <w:rPr>
+                    <w:rFonts w:cstheme="minorHAnsi"/>
+                  </w:rPr>
+                  <w:fldChar w:fldCharType="end"/>
+                </w:r>
+                <w:r>
+                  <w:rPr>
+                    <w:rFonts w:cstheme="minorHAnsi"/>
+                  </w:rPr>
+                  <w:t xml:space="preserve"> </w:t>
+                </w:r>
+                <w:r>
+                  <w:rPr>
+                    <w:rFonts w:cstheme="minorHAnsi"/>
+                  </w:rPr>
+                  <w:fldChar w:fldCharType="begin"/>
+                </w:r>
+                <w:r>
+                  <w:rPr>
+                    <w:rFonts w:cstheme="minorHAnsi"/>
+                  </w:rPr>
+                  <w:instrText xml:space="preserve"> REF _Ref232084668 \h </w:instrText>
+                </w:r>
+                <w:r>
+                  <w:rPr>
+                    <w:rFonts w:cstheme="minorHAnsi"/>
+                  </w:rPr>
+                </w:r>
+                <w:r>
+                  <w:rPr>
+                    <w:rFonts w:cstheme="minorHAnsi"/>
+                  </w:rPr>
+                  <w:fldChar w:fldCharType="separate"/>
                 </w:r>
                 <w:r>
                   <w:rPr>
                     <w:lang w:eastAsia="en-GB"/>
                   </w:rPr>
-                  <w:t>R</w:t>
-                </w:r>
-                <w:r>
-                  <w:rPr>
-                    <w:lang w:eastAsia="en-GB"/>
-                  </w:rPr>
-                  <w:t>L</w:t>
-                </w:r>
-                <w:r>
-                  <w:rPr>
-                    <w:lang w:eastAsia="en-GB"/>
-                  </w:rPr>
-                  <w:t xml:space="preserve"> bus</w:t>
+                  <w:t>Common bus signals</w:t>
                 </w:r>
                 <w:r>
                   <w:rPr>
@@ -1900,11 +1964,51 @@
                   </w:rPr>
                   <w:fldChar w:fldCharType="end"/>
                 </w:r>
-                <w:r>
-                  <w:rPr>
-                    <w:rFonts w:cstheme="minorHAnsi"/>
-                  </w:rPr>
-                  <w:t xml:space="preserve"> and </w:t>
+              </w:p>
+            </w:tc>
+          </w:tr>
+          <w:tr>
+            <w:tc>
+              <w:tcPr>
+                <w:tcW w:w="1384" w:type="dxa"/>
+              </w:tcPr>
+              <w:p>
+                <w:pPr>
+                  <w:rPr>
+                    <w:rFonts w:cstheme="minorHAnsi"/>
+                  </w:rPr>
+                </w:pPr>
+                <w:r>
+                  <w:rPr>
+                    <w:rFonts w:cstheme="minorHAnsi"/>
+                  </w:rPr>
+                  <w:t>4 Jul 2026</w:t>
+                </w:r>
+              </w:p>
+            </w:tc>
+            <w:tc>
+              <w:tcPr>
+                <w:tcW w:w="7858" w:type="dxa"/>
+              </w:tcPr>
+              <w:p>
+                <w:pPr>
+                  <w:rPr>
+                    <w:rFonts w:cstheme="minorHAnsi"/>
+                  </w:rPr>
+                </w:pPr>
+                <w:r>
+                  <w:rPr>
+                    <w:rFonts w:cstheme="minorHAnsi"/>
+                  </w:rPr>
+                  <w:t xml:space="preserve">Changes to match </w:t>
+                </w:r>
+                <w:bookmarkStart w:id="0" w:name="ChangeHistory"/>
+                <w:bookmarkEnd w:id="0"/>
+                <w:r>
+                  <w:rPr>
+                    <w:rFonts w:cstheme="minorHAnsi"/>
+                  </w:rPr>
+                  <w:t xml:space="preserve">ref </w:t>
                 </w:r>
                 <w:r>
                   <w:rPr>
@@ -1916,7 +2020,7 @@
                   <w:rPr>
                     <w:rFonts w:cstheme="minorHAnsi"/>
                   </w:rPr>
-                  <w:instrText xml:space="preserve"> REF _Ref232084668 \r \h </w:instrText>
+                  <w:instrText xml:space="preserve"> REF RefL1SeqXlsx \r \h </w:instrText>
                 </w:r>
                 <w:r>
                   <w:rPr>
@@ -1933,7 +2037,7 @@
                   <w:rPr>
                     <w:rFonts w:cstheme="minorHAnsi"/>
                   </w:rPr>
-                  <w:t>3.1</w:t>
+                  <w:t>2</w:t>
                 </w:r>
                 <w:r>
                   <w:rPr>
@@ -1945,42 +2049,7 @@
                   <w:rPr>
                     <w:rFonts w:cstheme="minorHAnsi"/>
                   </w:rPr>
-                  <w:t xml:space="preserve"> </w:t>
-                </w:r>
-                <w:r>
-                  <w:rPr>
-                    <w:rFonts w:cstheme="minorHAnsi"/>
-                  </w:rPr>
-                  <w:fldChar w:fldCharType="begin"/>
-                </w:r>
-                <w:r>
-                  <w:rPr>
-                    <w:rFonts w:cstheme="minorHAnsi"/>
-                  </w:rPr>
-                  <w:instrText xml:space="preserve"> REF _Ref232084668 \h </w:instrText>
-                </w:r>
-                <w:r>
-                  <w:rPr>
-                    <w:rFonts w:cstheme="minorHAnsi"/>
-                  </w:rPr>
-                </w:r>
-                <w:r>
-                  <w:rPr>
-                    <w:rFonts w:cstheme="minorHAnsi"/>
-                  </w:rPr>
-                  <w:fldChar w:fldCharType="separate"/>
-                </w:r>
-                <w:r>
-                  <w:rPr>
-                    <w:lang w:eastAsia="en-GB"/>
-                  </w:rPr>
-                  <w:t>Common bus signals</w:t>
-                </w:r>
-                <w:r>
-                  <w:rPr>
-                    <w:rFonts w:cstheme="minorHAnsi"/>
-                  </w:rPr>
-                  <w:fldChar w:fldCharType="end"/>
+                  <w:t xml:space="preserve"> signals changing from active low to active high</w:t>
                 </w:r>
               </w:p>
             </w:tc>
@@ -1994,8 +2063,6 @@
               <w:color w:val="4F81BD" w:themeColor="accent1"/>
             </w:rPr>
           </w:pPr>
-          <w:bookmarkStart w:id="0" w:name="ChangeHistory"/>
-          <w:bookmarkEnd w:id="0"/>
           <w:r>
             <w:rPr>
               <w:rFonts w:ascii="Cambria" w:hAnsi="Cambria"/>
@@ -2055,7 +2122,7 @@
           <w:r>
             <w:fldChar w:fldCharType="separate"/>
           </w:r>
-          <w:hyperlink w:anchor="_Toc233722261" w:history="1">
+          <w:hyperlink w:anchor="_Toc234053652" w:history="1">
             <w:r>
               <w:rPr>
                 <w:rStyle w:val="Hyperlink"/>
@@ -2101,7 +2168,7 @@
                 <w:noProof/>
                 <w:webHidden/>
               </w:rPr>
-              <w:instrText xml:space="preserve"> PAGEREF _Toc233722261 \h </w:instrText>
+              <w:instrText xml:space="preserve"> PAGEREF _Toc234053652 \h </w:instrText>
             </w:r>
             <w:r>
               <w:rPr>
@@ -2145,7 +2212,7 @@
               <w:lang w:eastAsia="en-GB"/>
             </w:rPr>
           </w:pPr>
-          <w:hyperlink w:anchor="_Toc233722262" w:history="1">
+          <w:hyperlink w:anchor="_Toc234053653" w:history="1">
             <w:r>
               <w:rPr>
                 <w:rStyle w:val="Hyperlink"/>
@@ -2189,7 +2256,7 @@
                 <w:noProof/>
                 <w:webHidden/>
               </w:rPr>
-              <w:instrText xml:space="preserve"> PAGEREF _Toc233722262 \h </w:instrText>
+              <w:instrText xml:space="preserve"> PAGEREF _Toc234053653 \h </w:instrText>
             </w:r>
             <w:r>
               <w:rPr>
@@ -2233,7 +2300,7 @@
               <w:lang w:eastAsia="en-GB"/>
             </w:rPr>
           </w:pPr>
-          <w:hyperlink w:anchor="_Toc233722263" w:history="1">
+          <w:hyperlink w:anchor="_Toc234053654" w:history="1">
             <w:r>
               <w:rPr>
                 <w:rStyle w:val="Hyperlink"/>
@@ -2275,7 +2342,7 @@
                 <w:noProof/>
                 <w:webHidden/>
               </w:rPr>
-              <w:instrText xml:space="preserve"> PAGEREF _Toc233722263 \h </w:instrText>
+              <w:instrText xml:space="preserve"> PAGEREF _Toc234053654 \h </w:instrText>
             </w:r>
             <w:r>
               <w:rPr>
@@ -2319,7 +2386,7 @@
               <w:lang w:eastAsia="en-GB"/>
             </w:rPr>
           </w:pPr>
-          <w:hyperlink w:anchor="_Toc233722264" w:history="1">
+          <w:hyperlink w:anchor="_Toc234053655" w:history="1">
             <w:r>
               <w:rPr>
                 <w:rStyle w:val="Hyperlink"/>
@@ -2361,7 +2428,7 @@
                 <w:noProof/>
                 <w:webHidden/>
               </w:rPr>
-              <w:instrText xml:space="preserve"> PAGEREF _Toc233722264 \h </w:instrText>
+              <w:instrText xml:space="preserve"> PAGEREF _Toc234053655 \h </w:instrText>
             </w:r>
             <w:r>
               <w:rPr>
@@ -2405,7 +2472,7 @@
               <w:lang w:eastAsia="en-GB"/>
             </w:rPr>
           </w:pPr>
-          <w:hyperlink w:anchor="_Toc233722265" w:history="1">
+          <w:hyperlink w:anchor="_Toc234053656" w:history="1">
             <w:r>
               <w:rPr>
                 <w:rStyle w:val="Hyperlink"/>
@@ -2447,7 +2514,7 @@
                 <w:noProof/>
                 <w:webHidden/>
               </w:rPr>
-              <w:instrText xml:space="preserve"> PAGEREF _Toc233722265 \h </w:instrText>
+              <w:instrText xml:space="preserve"> PAGEREF _Toc234053656 \h </w:instrText>
             </w:r>
             <w:r>
               <w:rPr>
@@ -2491,7 +2558,7 @@
               <w:lang w:eastAsia="en-GB"/>
             </w:rPr>
           </w:pPr>
-          <w:hyperlink w:anchor="_Toc233722266" w:history="1">
+          <w:hyperlink w:anchor="_Toc234053657" w:history="1">
             <w:r>
               <w:rPr>
                 <w:rStyle w:val="Hyperlink"/>
@@ -2533,7 +2600,7 @@
                 <w:noProof/>
                 <w:webHidden/>
               </w:rPr>
-              <w:instrText xml:space="preserve"> PAGEREF _Toc233722266 \h </w:instrText>
+              <w:instrText xml:space="preserve"> PAGEREF _Toc234053657 \h </w:instrText>
             </w:r>
             <w:r>
               <w:rPr>
@@ -2577,7 +2644,7 @@
               <w:lang w:eastAsia="en-GB"/>
             </w:rPr>
           </w:pPr>
-          <w:hyperlink w:anchor="_Toc233722267" w:history="1">
+          <w:hyperlink w:anchor="_Toc234053658" w:history="1">
             <w:r>
               <w:rPr>
                 <w:rStyle w:val="Hyperlink"/>
@@ -2619,7 +2686,7 @@
                 <w:noProof/>
                 <w:webHidden/>
               </w:rPr>
-              <w:instrText xml:space="preserve"> PAGEREF _Toc233722267 \h </w:instrText>
+              <w:instrText xml:space="preserve"> PAGEREF _Toc234053658 \h </w:instrText>
             </w:r>
             <w:r>
               <w:rPr>
@@ -2663,7 +2730,7 @@
               <w:lang w:eastAsia="en-GB"/>
             </w:rPr>
           </w:pPr>
-          <w:hyperlink w:anchor="_Toc233722268" w:history="1">
+          <w:hyperlink w:anchor="_Toc234053659" w:history="1">
             <w:r>
               <w:rPr>
                 <w:rStyle w:val="Hyperlink"/>
@@ -2707,7 +2774,7 @@
                 <w:noProof/>
                 <w:webHidden/>
               </w:rPr>
-              <w:instrText xml:space="preserve"> PAGEREF _Toc233722268 \h </w:instrText>
+              <w:instrText xml:space="preserve"> PAGEREF _Toc234053659 \h </w:instrText>
             </w:r>
             <w:r>
               <w:rPr>
@@ -2751,7 +2818,7 @@
               <w:lang w:eastAsia="en-GB"/>
             </w:rPr>
           </w:pPr>
-          <w:hyperlink w:anchor="_Toc233722269" w:history="1">
+          <w:hyperlink w:anchor="_Toc234053660" w:history="1">
             <w:r>
               <w:rPr>
                 <w:rStyle w:val="Hyperlink"/>
@@ -2795,7 +2862,7 @@
                 <w:noProof/>
                 <w:webHidden/>
               </w:rPr>
-              <w:instrText xml:space="preserve"> PAGEREF _Toc233722269 \h </w:instrText>
+              <w:instrText xml:space="preserve"> PAGEREF _Toc234053660 \h </w:instrText>
             </w:r>
             <w:r>
               <w:rPr>
@@ -2839,7 +2906,7 @@
               <w:lang w:eastAsia="en-GB"/>
             </w:rPr>
           </w:pPr>
-          <w:hyperlink w:anchor="_Toc233722270" w:history="1">
+          <w:hyperlink w:anchor="_Toc234053661" w:history="1">
             <w:r>
               <w:rPr>
                 <w:rStyle w:val="Hyperlink"/>
@@ -2883,7 +2950,7 @@
                 <w:noProof/>
                 <w:webHidden/>
               </w:rPr>
-              <w:instrText xml:space="preserve"> PAGEREF _Toc233722270 \h </w:instrText>
+              <w:instrText xml:space="preserve"> PAGEREF _Toc234053661 \h </w:instrText>
             </w:r>
             <w:r>
               <w:rPr>
@@ -2927,7 +2994,7 @@
               <w:lang w:eastAsia="en-GB"/>
             </w:rPr>
           </w:pPr>
-          <w:hyperlink w:anchor="_Toc233722271" w:history="1">
+          <w:hyperlink w:anchor="_Toc234053662" w:history="1">
             <w:r>
               <w:rPr>
                 <w:rStyle w:val="Hyperlink"/>
@@ -2971,7 +3038,7 @@
                 <w:noProof/>
                 <w:webHidden/>
               </w:rPr>
-              <w:instrText xml:space="preserve"> PAGEREF _Toc233722271 \h </w:instrText>
+              <w:instrText xml:space="preserve"> PAGEREF _Toc234053662 \h </w:instrText>
             </w:r>
             <w:r>
               <w:rPr>
@@ -2991,7 +3058,7 @@
                 <w:noProof/>
                 <w:webHidden/>
               </w:rPr>
-              <w:t>4</w:t>
+              <w:t>5</w:t>
             </w:r>
             <w:r>
               <w:rPr>
@@ -3015,7 +3082,7 @@
               <w:lang w:eastAsia="en-GB"/>
             </w:rPr>
           </w:pPr>
-          <w:hyperlink w:anchor="_Toc233722272" w:history="1">
+          <w:hyperlink w:anchor="_Toc234053663" w:history="1">
             <w:r>
               <w:rPr>
                 <w:rStyle w:val="Hyperlink"/>
@@ -3059,7 +3126,7 @@
                 <w:noProof/>
                 <w:webHidden/>
               </w:rPr>
-              <w:instrText xml:space="preserve"> PAGEREF _Toc233722272 \h </w:instrText>
+              <w:instrText xml:space="preserve"> PAGEREF _Toc234053663 \h </w:instrText>
             </w:r>
             <w:r>
               <w:rPr>
@@ -3103,7 +3170,7 @@
               <w:lang w:eastAsia="en-GB"/>
             </w:rPr>
           </w:pPr>
-          <w:hyperlink w:anchor="_Toc233722273" w:history="1">
+          <w:hyperlink w:anchor="_Toc234053664" w:history="1">
             <w:r>
               <w:rPr>
                 <w:rStyle w:val="Hyperlink"/>
@@ -3147,7 +3214,7 @@
                 <w:noProof/>
                 <w:webHidden/>
               </w:rPr>
-              <w:instrText xml:space="preserve"> PAGEREF _Toc233722273 \h </w:instrText>
+              <w:instrText xml:space="preserve"> PAGEREF _Toc234053664 \h </w:instrText>
             </w:r>
             <w:r>
               <w:rPr>
@@ -3191,7 +3258,7 @@
               <w:lang w:eastAsia="en-GB"/>
             </w:rPr>
           </w:pPr>
-          <w:hyperlink w:anchor="_Toc233722274" w:history="1">
+          <w:hyperlink w:anchor="_Toc234053665" w:history="1">
             <w:r>
               <w:rPr>
                 <w:rStyle w:val="Hyperlink"/>
@@ -3235,7 +3302,7 @@
                 <w:noProof/>
                 <w:webHidden/>
               </w:rPr>
-              <w:instrText xml:space="preserve"> PAGEREF _Toc233722274 \h </w:instrText>
+              <w:instrText xml:space="preserve"> PAGEREF _Toc234053665 \h </w:instrText>
             </w:r>
             <w:r>
               <w:rPr>
@@ -3279,7 +3346,7 @@
               <w:lang w:eastAsia="en-GB"/>
             </w:rPr>
           </w:pPr>
-          <w:hyperlink w:anchor="_Toc233722275" w:history="1">
+          <w:hyperlink w:anchor="_Toc234053666" w:history="1">
             <w:r>
               <w:rPr>
                 <w:rStyle w:val="Hyperlink"/>
@@ -3323,7 +3390,7 @@
                 <w:noProof/>
                 <w:webHidden/>
               </w:rPr>
-              <w:instrText xml:space="preserve"> PAGEREF _Toc233722275 \h </w:instrText>
+              <w:instrText xml:space="preserve"> PAGEREF _Toc234053666 \h </w:instrText>
             </w:r>
             <w:r>
               <w:rPr>
@@ -3367,7 +3434,7 @@
               <w:lang w:eastAsia="en-GB"/>
             </w:rPr>
           </w:pPr>
-          <w:hyperlink w:anchor="_Toc233722276" w:history="1">
+          <w:hyperlink w:anchor="_Toc234053667" w:history="1">
             <w:r>
               <w:rPr>
                 <w:rStyle w:val="Hyperlink"/>
@@ -3411,7 +3478,7 @@
                 <w:noProof/>
                 <w:webHidden/>
               </w:rPr>
-              <w:instrText xml:space="preserve"> PAGEREF _Toc233722276 \h </w:instrText>
+              <w:instrText xml:space="preserve"> PAGEREF _Toc234053667 \h </w:instrText>
             </w:r>
             <w:r>
               <w:rPr>
@@ -3455,7 +3522,7 @@
               <w:lang w:eastAsia="en-GB"/>
             </w:rPr>
           </w:pPr>
-          <w:hyperlink w:anchor="_Toc233722277" w:history="1">
+          <w:hyperlink w:anchor="_Toc234053668" w:history="1">
             <w:r>
               <w:rPr>
                 <w:rStyle w:val="Hyperlink"/>
@@ -3499,7 +3566,7 @@
                 <w:noProof/>
                 <w:webHidden/>
               </w:rPr>
-              <w:instrText xml:space="preserve"> PAGEREF _Toc233722277 \h </w:instrText>
+              <w:instrText xml:space="preserve"> PAGEREF _Toc234053668 \h </w:instrText>
             </w:r>
             <w:r>
               <w:rPr>
@@ -3543,7 +3610,7 @@
               <w:lang w:eastAsia="en-GB"/>
             </w:rPr>
           </w:pPr>
-          <w:hyperlink w:anchor="_Toc233722278" w:history="1">
+          <w:hyperlink w:anchor="_Toc234053669" w:history="1">
             <w:r>
               <w:rPr>
                 <w:rStyle w:val="Hyperlink"/>
@@ -3587,7 +3654,7 @@
                 <w:noProof/>
                 <w:webHidden/>
               </w:rPr>
-              <w:instrText xml:space="preserve"> PAGEREF _Toc233722278 \h </w:instrText>
+              <w:instrText xml:space="preserve"> PAGEREF _Toc234053669 \h </w:instrText>
             </w:r>
             <w:r>
               <w:rPr>
@@ -3631,7 +3698,7 @@
               <w:lang w:eastAsia="en-GB"/>
             </w:rPr>
           </w:pPr>
-          <w:hyperlink w:anchor="_Toc233722279" w:history="1">
+          <w:hyperlink w:anchor="_Toc234053670" w:history="1">
             <w:r>
               <w:rPr>
                 <w:rStyle w:val="Hyperlink"/>
@@ -3675,7 +3742,7 @@
                 <w:noProof/>
                 <w:webHidden/>
               </w:rPr>
-              <w:instrText xml:space="preserve"> PAGEREF _Toc233722279 \h </w:instrText>
+              <w:instrText xml:space="preserve"> PAGEREF _Toc234053670 \h </w:instrText>
             </w:r>
             <w:r>
               <w:rPr>
@@ -3719,7 +3786,7 @@
               <w:lang w:eastAsia="en-GB"/>
             </w:rPr>
           </w:pPr>
-          <w:hyperlink w:anchor="_Toc233722280" w:history="1">
+          <w:hyperlink w:anchor="_Toc234053671" w:history="1">
             <w:r>
               <w:rPr>
                 <w:rStyle w:val="Hyperlink"/>
@@ -3763,7 +3830,7 @@
                 <w:noProof/>
                 <w:webHidden/>
               </w:rPr>
-              <w:instrText xml:space="preserve"> PAGEREF _Toc233722280 \h </w:instrText>
+              <w:instrText xml:space="preserve"> PAGEREF _Toc234053671 \h </w:instrText>
             </w:r>
             <w:r>
               <w:rPr>
@@ -3872,7 +3939,7 @@
         </w:rPr>
         <w:fldChar w:fldCharType="separate"/>
       </w:r>
-      <w:hyperlink w:anchor="_Toc233722281" w:history="1">
+      <w:hyperlink w:anchor="_Toc234053672" w:history="1">
         <w:r>
           <w:rPr>
             <w:rStyle w:val="Hyperlink"/>
@@ -3899,7 +3966,7 @@
             <w:noProof/>
             <w:webHidden/>
           </w:rPr>
-          <w:instrText xml:space="preserve"> PAGEREF _Toc233722281 \h </w:instrText>
+          <w:instrText xml:space="preserve"> PAGEREF _Toc234053672 \h </w:instrText>
         </w:r>
         <w:r>
           <w:rPr>
@@ -3942,7 +4009,7 @@
           <w:lang w:eastAsia="en-GB"/>
         </w:rPr>
       </w:pPr>
-      <w:hyperlink w:anchor="_Toc233722282" w:history="1">
+      <w:hyperlink w:anchor="_Toc234053673" w:history="1">
         <w:r>
           <w:rPr>
             <w:rStyle w:val="Hyperlink"/>
@@ -3969,7 +4036,7 @@
             <w:noProof/>
             <w:webHidden/>
           </w:rPr>
-          <w:instrText xml:space="preserve"> PAGEREF _Toc233722282 \h </w:instrText>
+          <w:instrText xml:space="preserve"> PAGEREF _Toc234053673 \h </w:instrText>
         </w:r>
         <w:r>
           <w:rPr>
@@ -4049,7 +4116,7 @@
           <w:lang w:eastAsia="en-GB"/>
         </w:rPr>
       </w:pPr>
-      <w:bookmarkStart w:id="2" w:name="_Toc233722261"/>
+      <w:bookmarkStart w:id="2" w:name="_Toc234053652"/>
       <w:bookmarkEnd w:id="1"/>
       <w:r>
         <w:rPr>
@@ -4100,7 +4167,7 @@
           <w:lang w:eastAsia="en-GB"/>
         </w:rPr>
       </w:pPr>
-      <w:bookmarkStart w:id="3" w:name="_Toc233722262"/>
+      <w:bookmarkStart w:id="3" w:name="_Toc234053653"/>
       <w:r>
         <w:rPr>
           <w:lang w:eastAsia="en-GB"/>
@@ -4241,7 +4308,7 @@
         <w:jc w:val="center"/>
       </w:pPr>
       <w:bookmarkStart w:id="4" w:name="_Ref232073454"/>
-      <w:bookmarkStart w:id="5" w:name="_Toc233722281"/>
+      <w:bookmarkStart w:id="5" w:name="_Toc234053672"/>
       <w:r>
         <w:t xml:space="preserve">Figure </w:t>
       </w:r>
@@ -4661,7 +4728,7 @@
         <w:pStyle w:val="Heading2"/>
       </w:pPr>
       <w:bookmarkStart w:id="6" w:name="_Ref233631401"/>
-      <w:bookmarkStart w:id="7" w:name="_Toc233722263"/>
+      <w:bookmarkStart w:id="7" w:name="_Toc234053654"/>
       <w:r>
         <w:lastRenderedPageBreak/>
         <w:t xml:space="preserve">Overview of </w:t>
@@ -4748,9 +4815,9 @@
         </w:rPr>
         <w:drawing>
           <wp:inline distT="0" distB="0" distL="0" distR="0">
-            <wp:extent cx="4343400" cy="1744980"/>
+            <wp:extent cx="4577305" cy="1746000"/>
             <wp:effectExtent l="19050" t="0" r="0" b="0"/>
-            <wp:docPr id="7" name="Picture 7"/>
+            <wp:docPr id="1" name="Picture 1"/>
             <wp:cNvGraphicFramePr>
               <a:graphicFrameLocks xmlns:a="http://schemas.openxmlformats.org/drawingml/2006/main" noChangeAspect="1"/>
             </wp:cNvGraphicFramePr>
@@ -4758,7 +4825,7 @@
               <a:graphicData uri="http://schemas.openxmlformats.org/drawingml/2006/picture">
                 <pic:pic xmlns:pic="http://schemas.openxmlformats.org/drawingml/2006/picture">
                   <pic:nvPicPr>
-                    <pic:cNvPr id="0" name="Picture 7"/>
+                    <pic:cNvPr id="0" name="Picture 1"/>
                     <pic:cNvPicPr>
                       <a:picLocks noChangeAspect="1" noChangeArrowheads="1"/>
                     </pic:cNvPicPr>
@@ -4773,7 +4840,7 @@
                   <pic:spPr bwMode="auto">
                     <a:xfrm>
                       <a:off x="0" y="0"/>
-                      <a:ext cx="4343400" cy="1744980"/>
+                      <a:ext cx="4577305" cy="1746000"/>
                     </a:xfrm>
                     <a:prstGeom prst="rect">
                       <a:avLst/>
@@ -4799,7 +4866,7 @@
         <w:jc w:val="center"/>
       </w:pPr>
       <w:bookmarkStart w:id="8" w:name="_Ref233626426"/>
-      <w:bookmarkStart w:id="9" w:name="_Toc233722282"/>
+      <w:bookmarkStart w:id="9" w:name="_Toc234053673"/>
       <w:r>
         <w:t xml:space="preserve">Figure </w:t>
       </w:r>
@@ -4884,7 +4951,19 @@
         <w:t>CLOCK</w:t>
       </w:r>
       <w:r>
-        <w:t xml:space="preserve"> changes from low to high.</w:t>
+        <w:t xml:space="preserve"> changes from </w:t>
+      </w:r>
+      <w:r>
+        <w:t>high</w:t>
+      </w:r>
+      <w:r>
+        <w:t xml:space="preserve"> to </w:t>
+      </w:r>
+      <w:r>
+        <w:t>low</w:t>
+      </w:r>
+      <w:r>
+        <w:t>.</w:t>
       </w:r>
     </w:p>
     <w:p>
@@ -4913,7 +4992,13 @@
         <w:t>ll</w:t>
       </w:r>
       <w:r>
-        <w:t xml:space="preserve"> SELECTs are all low. The data bus is floating.</w:t>
+        <w:t xml:space="preserve"> SELECTs are all </w:t>
+      </w:r>
+      <w:r>
+        <w:t>high</w:t>
+      </w:r>
+      <w:r>
+        <w:t>. The data bus is floating.</w:t>
       </w:r>
     </w:p>
     <w:p>
@@ -4942,7 +5027,13 @@
         <w:t>es</w:t>
       </w:r>
       <w:r>
-        <w:t xml:space="preserve"> high a short time after the rising edge of T1 CLOCK.</w:t>
+        <w:t xml:space="preserve"> </w:t>
+      </w:r>
+      <w:r>
+        <w:t>low</w:t>
+      </w:r>
+      <w:r>
+        <w:t xml:space="preserve"> a short time after the rising edge of T1 CLOCK.</w:t>
       </w:r>
     </w:p>
     <w:p>
@@ -4960,7 +5051,13 @@
         <w:t>es</w:t>
       </w:r>
       <w:r>
-        <w:t xml:space="preserve"> high. </w:t>
+        <w:t xml:space="preserve"> </w:t>
+      </w:r>
+      <w:r>
+        <w:t>low</w:t>
+      </w:r>
+      <w:r>
+        <w:t xml:space="preserve">. </w:t>
       </w:r>
     </w:p>
     <w:p>
@@ -5004,7 +5101,13 @@
         <w:t>es</w:t>
       </w:r>
       <w:r>
-        <w:t xml:space="preserve"> high a short time after the rising edge of T2 CLOCK.</w:t>
+        <w:t xml:space="preserve"> </w:t>
+      </w:r>
+      <w:r>
+        <w:t>low</w:t>
+      </w:r>
+      <w:r>
+        <w:t xml:space="preserve"> a short time after the rising edge of T2 CLOCK.</w:t>
       </w:r>
     </w:p>
     <w:p>
@@ -5016,7 +5119,13 @@
         </w:numPr>
       </w:pPr>
       <w:r>
-        <w:t xml:space="preserve">The selected destination should read the value from DBUS on the rising edge of </w:t>
+        <w:t xml:space="preserve">The selected destination should read the value from DBUS on the </w:t>
+      </w:r>
+      <w:r>
+        <w:t>falling</w:t>
+      </w:r>
+      <w:r>
+        <w:t xml:space="preserve"> edge of </w:t>
       </w:r>
       <w:r>
         <w:t>SELECT &lt;DESTINATION&gt;</w:t>
@@ -5045,7 +5154,13 @@
         <w:t>A</w:t>
       </w:r>
       <w:r>
-        <w:t>ll SELECTs go low a short time after the rising edge of T3 CLOCK</w:t>
+        <w:t xml:space="preserve">ll SELECTs go </w:t>
+      </w:r>
+      <w:r>
+        <w:t>high</w:t>
+      </w:r>
+      <w:r>
+        <w:t xml:space="preserve"> a short time after the rising edge of T3 CLOCK</w:t>
       </w:r>
     </w:p>
     <w:p>
@@ -5063,7 +5178,13 @@
         <w:t>es</w:t>
       </w:r>
       <w:r>
-        <w:t xml:space="preserve"> low.</w:t>
+        <w:t xml:space="preserve"> </w:t>
+      </w:r>
+      <w:r>
+        <w:t>high</w:t>
+      </w:r>
+      <w:r>
+        <w:t>.</w:t>
       </w:r>
     </w:p>
     <w:p>
@@ -5088,7 +5209,7 @@
         <w:pStyle w:val="Heading3"/>
       </w:pPr>
       <w:bookmarkStart w:id="10" w:name="_Ref232850548"/>
-      <w:bookmarkStart w:id="11" w:name="_Toc233722264"/>
+      <w:bookmarkStart w:id="11" w:name="_Toc234053655"/>
       <w:r>
         <w:lastRenderedPageBreak/>
         <w:t>Reading f</w:t>
@@ -5376,7 +5497,19 @@
         <w:rPr>
           <w:lang w:eastAsia="en-GB"/>
         </w:rPr>
-        <w:t xml:space="preserve"> is LOW, </w:t>
+        <w:t xml:space="preserve"> is </w:t>
+      </w:r>
+      <w:r>
+        <w:rPr>
+          <w:lang w:eastAsia="en-GB"/>
+        </w:rPr>
+        <w:t>HIGH</w:t>
+      </w:r>
+      <w:r>
+        <w:rPr>
+          <w:lang w:eastAsia="en-GB"/>
+        </w:rPr>
+        <w:t xml:space="preserve">, </w:t>
       </w:r>
       <w:r>
         <w:rPr>
@@ -5424,7 +5557,19 @@
         <w:rPr>
           <w:lang w:eastAsia="en-GB"/>
         </w:rPr>
-        <w:t xml:space="preserve">Read on rising edge of  </w:t>
+        <w:t>R</w:t>
+      </w:r>
+      <w:r>
+        <w:rPr>
+          <w:lang w:eastAsia="en-GB"/>
+        </w:rPr>
+        <w:t>ead on falling</w:t>
+      </w:r>
+      <w:r>
+        <w:rPr>
+          <w:lang w:eastAsia="en-GB"/>
+        </w:rPr>
+        <w:t xml:space="preserve"> edge of  </w:t>
       </w:r>
       <w:proofErr w:type="spellStart"/>
       <w:r>
@@ -5470,6 +5615,12 @@
         </w:rPr>
         <w:t>Read when (</w:t>
       </w:r>
+      <w:r>
+        <w:rPr>
+          <w:lang w:eastAsia="en-GB"/>
+        </w:rPr>
+        <w:t>!</w:t>
+      </w:r>
       <w:proofErr w:type="spellStart"/>
       <w:r>
         <w:rPr>
@@ -5488,7 +5639,13 @@
         <w:rPr>
           <w:lang w:eastAsia="en-GB"/>
         </w:rPr>
-        <w:t xml:space="preserve"> is high</w:t>
+        <w:t xml:space="preserve"> is </w:t>
+      </w:r>
+      <w:r>
+        <w:rPr>
+          <w:lang w:eastAsia="en-GB"/>
+        </w:rPr>
+        <w:t>low</w:t>
       </w:r>
       <w:bookmarkStart w:id="12" w:name="_Ref232850585"/>
     </w:p>
@@ -5500,7 +5657,7 @@
       <w:bookmarkStart w:id="14" w:name="_Ref233721180"/>
       <w:bookmarkStart w:id="15" w:name="_Ref233721252"/>
       <w:bookmarkStart w:id="16" w:name="_Ref233721322"/>
-      <w:bookmarkStart w:id="17" w:name="_Toc233722265"/>
+      <w:bookmarkStart w:id="17" w:name="_Toc234053656"/>
       <w:r>
         <w:t>Writing t</w:t>
       </w:r>
@@ -5744,7 +5901,19 @@
         <w:rPr>
           <w:lang w:eastAsia="en-GB"/>
         </w:rPr>
-        <w:t xml:space="preserve"> is LOW, then </w:t>
+        <w:t xml:space="preserve"> is </w:t>
+      </w:r>
+      <w:r>
+        <w:rPr>
+          <w:lang w:eastAsia="en-GB"/>
+        </w:rPr>
+        <w:t>HIGH</w:t>
+      </w:r>
+      <w:r>
+        <w:rPr>
+          <w:lang w:eastAsia="en-GB"/>
+        </w:rPr>
+        <w:t xml:space="preserve">, then </w:t>
       </w:r>
       <w:r>
         <w:rPr>
@@ -5800,7 +5969,13 @@
         <w:rPr>
           <w:lang w:eastAsia="en-GB"/>
         </w:rPr>
-        <w:t xml:space="preserve"> is HIGH</w:t>
+        <w:t xml:space="preserve"> is </w:t>
+      </w:r>
+      <w:r>
+        <w:rPr>
+          <w:lang w:eastAsia="en-GB"/>
+        </w:rPr>
+        <w:t>LOW</w:t>
       </w:r>
       <w:r>
         <w:rPr>
@@ -5838,7 +6013,7 @@
         <w:pStyle w:val="Heading2"/>
       </w:pPr>
       <w:bookmarkStart w:id="18" w:name="_Ref232849573"/>
-      <w:bookmarkStart w:id="19" w:name="_Toc233722266"/>
+      <w:bookmarkStart w:id="19" w:name="_Toc234053657"/>
       <w:r>
         <w:t>Overview of GP and SP registers</w:t>
       </w:r>
@@ -5867,7 +6042,7 @@
       </w:pPr>
       <w:bookmarkStart w:id="20" w:name="_Ref232926928"/>
       <w:bookmarkStart w:id="21" w:name="_Ref232926933"/>
-      <w:bookmarkStart w:id="22" w:name="_Toc233722267"/>
+      <w:bookmarkStart w:id="22" w:name="_Toc234053658"/>
       <w:r>
         <w:t>SP Behaviour</w:t>
       </w:r>
@@ -5989,15 +6164,15 @@
           <w:lang w:eastAsia="en-GB"/>
         </w:rPr>
       </w:pPr>
-      <w:bookmarkStart w:id="23" w:name="_Toc233722268"/>
-      <w:bookmarkStart w:id="24" w:name="_Ref172648415"/>
+      <w:bookmarkStart w:id="23" w:name="_Ref172648415"/>
+      <w:bookmarkStart w:id="24" w:name="_Toc234053659"/>
       <w:r>
         <w:rPr>
           <w:lang w:eastAsia="en-GB"/>
         </w:rPr>
         <w:t>Other Busses</w:t>
       </w:r>
-      <w:bookmarkEnd w:id="23"/>
+      <w:bookmarkEnd w:id="24"/>
     </w:p>
     <w:p>
       <w:pPr>
@@ -6699,7 +6874,7 @@
       <w:bookmarkStart w:id="26" w:name="_Ref232084946"/>
       <w:bookmarkStart w:id="27" w:name="_Ref232086890"/>
       <w:bookmarkStart w:id="28" w:name="_Ref232086990"/>
-      <w:bookmarkStart w:id="29" w:name="_Toc233722269"/>
+      <w:bookmarkStart w:id="29" w:name="_Toc234053660"/>
       <w:r>
         <w:rPr>
           <w:lang w:eastAsia="en-GB"/>
@@ -6820,7 +6995,31 @@
         <w:rPr>
           <w:lang w:eastAsia="en-GB"/>
         </w:rPr>
-        <w:t>Starts high at power up, then changes to low after some time T on the rising edge of a CLOCK.</w:t>
+        <w:t xml:space="preserve">Starts </w:t>
+      </w:r>
+      <w:r>
+        <w:rPr>
+          <w:lang w:eastAsia="en-GB"/>
+        </w:rPr>
+        <w:t>low</w:t>
+      </w:r>
+      <w:r>
+        <w:rPr>
+          <w:lang w:eastAsia="en-GB"/>
+        </w:rPr>
+        <w:t xml:space="preserve"> at power up, then changes to </w:t>
+      </w:r>
+      <w:r>
+        <w:rPr>
+          <w:lang w:eastAsia="en-GB"/>
+        </w:rPr>
+        <w:t>high</w:t>
+      </w:r>
+      <w:r>
+        <w:rPr>
+          <w:lang w:eastAsia="en-GB"/>
+        </w:rPr>
+        <w:t xml:space="preserve"> after some time T on the rising edge of a CLOCK.</w:t>
       </w:r>
       <w:r>
         <w:rPr>
@@ -6837,7 +7036,7 @@
         </w:rPr>
       </w:pPr>
       <w:bookmarkStart w:id="30" w:name="_Ref232081276"/>
-      <w:bookmarkStart w:id="31" w:name="_Toc233722270"/>
+      <w:bookmarkStart w:id="31" w:name="_Toc234053661"/>
       <w:r>
         <w:rPr>
           <w:lang w:eastAsia="en-GB"/>
@@ -6868,7 +7067,7 @@
         </w:rPr>
       </w:pPr>
       <w:bookmarkStart w:id="32" w:name="_Ref232081291"/>
-      <w:bookmarkStart w:id="33" w:name="_Toc233722271"/>
+      <w:bookmarkStart w:id="33" w:name="_Toc234053662"/>
       <w:r>
         <w:rPr>
           <w:lang w:eastAsia="en-GB"/>
@@ -6901,7 +7100,7 @@
         </w:rPr>
       </w:pPr>
       <w:bookmarkStart w:id="35" w:name="_Ref233021496"/>
-      <w:bookmarkStart w:id="36" w:name="_Toc233722272"/>
+      <w:bookmarkStart w:id="36" w:name="_Toc234053663"/>
       <w:r>
         <w:rPr>
           <w:lang w:eastAsia="en-GB"/>
@@ -7105,19 +7304,7 @@
         <w:rPr>
           <w:lang w:eastAsia="en-GB"/>
         </w:rPr>
-        <w:t>3</w:t>
-      </w:r>
-      <w:r>
-        <w:rPr>
-          <w:lang w:eastAsia="en-GB"/>
-        </w:rPr>
-        <w:t>.</w:t>
-      </w:r>
-      <w:r>
-        <w:rPr>
-          <w:lang w:eastAsia="en-GB"/>
-        </w:rPr>
-        <w:t>1</w:t>
+        <w:t>3.1</w:t>
       </w:r>
       <w:r>
         <w:rPr>
@@ -7470,7 +7657,7 @@
         </w:rPr>
       </w:pPr>
       <w:bookmarkStart w:id="38" w:name="_Ref232090743"/>
-      <w:bookmarkStart w:id="39" w:name="_Toc233722273"/>
+      <w:bookmarkStart w:id="39" w:name="_Toc234053664"/>
       <w:r>
         <w:rPr>
           <w:lang w:eastAsia="en-GB"/>
@@ -7961,7 +8148,7 @@
         </w:rPr>
       </w:pPr>
       <w:bookmarkStart w:id="41" w:name="_Ref232090753"/>
-      <w:bookmarkStart w:id="42" w:name="_Toc233722274"/>
+      <w:bookmarkStart w:id="42" w:name="_Toc234053665"/>
       <w:r>
         <w:rPr>
           <w:lang w:eastAsia="en-GB"/>
@@ -8338,7 +8525,7 @@
         </w:rPr>
       </w:pPr>
       <w:bookmarkStart w:id="43" w:name="_Ref233191365"/>
-      <w:bookmarkStart w:id="44" w:name="_Toc233722275"/>
+      <w:bookmarkStart w:id="44" w:name="_Toc234053666"/>
       <w:r>
         <w:rPr>
           <w:lang w:eastAsia="en-GB"/>
@@ -8448,7 +8635,7 @@
         </w:rPr>
       </w:pPr>
       <w:bookmarkStart w:id="46" w:name="_Ref232851000"/>
-      <w:bookmarkStart w:id="47" w:name="_Toc233722276"/>
+      <w:bookmarkStart w:id="47" w:name="_Toc234053667"/>
       <w:r>
         <w:rPr>
           <w:lang w:eastAsia="en-GB"/>
@@ -10198,7 +10385,7 @@
         </w:rPr>
       </w:pPr>
       <w:bookmarkStart w:id="55" w:name="_Ref232090831"/>
-      <w:bookmarkStart w:id="56" w:name="_Toc233722277"/>
+      <w:bookmarkStart w:id="56" w:name="_Toc234053668"/>
       <w:r>
         <w:rPr>
           <w:lang w:eastAsia="en-GB"/>
@@ -10556,7 +10743,7 @@
           <w:lang w:eastAsia="en-GB"/>
         </w:rPr>
       </w:pPr>
-      <w:bookmarkStart w:id="57" w:name="_Toc233722278"/>
+      <w:bookmarkStart w:id="57" w:name="_Toc234053669"/>
       <w:r>
         <w:rPr>
           <w:lang w:eastAsia="en-GB"/>
@@ -10727,7 +10914,7 @@
           <w:lang w:eastAsia="en-GB"/>
         </w:rPr>
       </w:pPr>
-      <w:bookmarkStart w:id="58" w:name="_Toc233722279"/>
+      <w:bookmarkStart w:id="58" w:name="_Toc234053670"/>
       <w:r>
         <w:rPr>
           <w:lang w:eastAsia="en-GB"/>
@@ -12258,7 +12445,7 @@
           <w:lang w:eastAsia="en-GB"/>
         </w:rPr>
       </w:pPr>
-      <w:bookmarkStart w:id="64" w:name="_Toc233722280"/>
+      <w:bookmarkStart w:id="64" w:name="_Toc234053671"/>
       <w:r>
         <w:rPr>
           <w:lang w:eastAsia="en-GB"/>
@@ -12266,7 +12453,7 @@
         <w:lastRenderedPageBreak/>
         <w:t>References</w:t>
       </w:r>
-      <w:bookmarkEnd w:id="24"/>
+      <w:bookmarkEnd w:id="23"/>
       <w:bookmarkEnd w:id="64"/>
     </w:p>
     <w:bookmarkStart w:id="65" w:name="AVR_Instruction_Doc"/>
@@ -12297,6 +12484,11 @@
         <w:rPr>
           <w:lang w:eastAsia="en-GB"/>
         </w:rPr>
+      </w:r>
+      <w:r>
+        <w:rPr>
+          <w:lang w:eastAsia="en-GB"/>
+        </w:rPr>
         <w:fldChar w:fldCharType="separate"/>
       </w:r>
       <w:r>
@@ -12313,6 +12505,63 @@
         </w:rPr>
         <w:fldChar w:fldCharType="end"/>
       </w:r>
+    </w:p>
+    <w:bookmarkStart w:id="66" w:name="RefL1SeqXlsx"/>
+    <w:p>
+      <w:pPr>
+        <w:pStyle w:val="ListParagraph"/>
+        <w:numPr>
+          <w:ilvl w:val="0"/>
+          <w:numId w:val="2"/>
+        </w:numPr>
+        <w:rPr>
+          <w:lang w:eastAsia="en-GB"/>
+        </w:rPr>
+      </w:pPr>
+      <w:r>
+        <w:rPr>
+          <w:lang w:eastAsia="en-GB"/>
+        </w:rPr>
+        <w:fldChar w:fldCharType="begin"/>
+      </w:r>
+      <w:r>
+        <w:rPr>
+          <w:lang w:eastAsia="en-GB"/>
+        </w:rPr>
+        <w:instrText>HYPERLINK "C:\\Users\\David\\Dropbox\\WorkArea\\Electronics\\Earth\\GitHubDocs\\Matsuzaka-I-Document\\CPU Design\\L1IsSequences.xlsx"</w:instrText>
+      </w:r>
+      <w:r>
+        <w:rPr>
+          <w:lang w:eastAsia="en-GB"/>
+        </w:rPr>
+      </w:r>
+      <w:r>
+        <w:rPr>
+          <w:lang w:eastAsia="en-GB"/>
+        </w:rPr>
+        <w:fldChar w:fldCharType="separate"/>
+      </w:r>
+      <w:r>
+        <w:rPr>
+          <w:rStyle w:val="Hyperlink"/>
+          <w:lang w:eastAsia="en-GB"/>
+        </w:rPr>
+        <w:t>L1IsSequences.xlsx</w:t>
+      </w:r>
+      <w:r>
+        <w:rPr>
+          <w:lang w:eastAsia="en-GB"/>
+        </w:rPr>
+        <w:fldChar w:fldCharType="end"/>
+      </w:r>
+      <w:bookmarkEnd w:id="66"/>
+    </w:p>
+    <w:p>
+      <w:pPr>
+        <w:rPr>
+          <w:lang w:eastAsia="en-GB"/>
+        </w:rPr>
+      </w:pPr>
     </w:p>
     <w:p>
       <w:pPr>
@@ -12431,7 +12680,7 @@
               <w:b/>
               <w:noProof/>
             </w:rPr>
-            <w:t>5</w:t>
+            <w:t>ii</w:t>
           </w:r>
         </w:fldSimple>
       </w:p>
@@ -16924,7 +17173,7 @@
 </file>
 
 <file path=customXml/itemProps2.xml><?xml version="1.0" encoding="utf-8"?>
-<ds:datastoreItem xmlns:ds="http://schemas.openxmlformats.org/officeDocument/2006/customXml" ds:itemID="{E7A8A3C7-E53F-4F86-9DF3-E5B2A88B014A}">
+<ds:datastoreItem xmlns:ds="http://schemas.openxmlformats.org/officeDocument/2006/customXml" ds:itemID="{893E6A52-2A2A-446A-A924-4D4FE84B9925}">
   <ds:schemaRefs>
     <ds:schemaRef ds:uri="http://schemas.openxmlformats.org/officeDocument/2006/bibliography"/>
   </ds:schemaRefs>

</xml_diff>

<commit_message>
Improved the English. No behaviour changes
</commit_message>
<xml_diff>
--- a/CPU Design/CpuDesign.docx
+++ b/CPU Design/CpuDesign.docx
@@ -2054,6 +2054,44 @@
               </w:p>
             </w:tc>
           </w:tr>
+          <w:tr>
+            <w:tc>
+              <w:tcPr>
+                <w:tcW w:w="1384" w:type="dxa"/>
+              </w:tcPr>
+              <w:p>
+                <w:pPr>
+                  <w:rPr>
+                    <w:rFonts w:cstheme="minorHAnsi"/>
+                  </w:rPr>
+                </w:pPr>
+                <w:r>
+                  <w:rPr>
+                    <w:rFonts w:cstheme="minorHAnsi"/>
+                  </w:rPr>
+                  <w:t>4 Jul 2026</w:t>
+                </w:r>
+              </w:p>
+            </w:tc>
+            <w:tc>
+              <w:tcPr>
+                <w:tcW w:w="7858" w:type="dxa"/>
+              </w:tcPr>
+              <w:p>
+                <w:pPr>
+                  <w:rPr>
+                    <w:rFonts w:cstheme="minorHAnsi"/>
+                  </w:rPr>
+                </w:pPr>
+                <w:r>
+                  <w:rPr>
+                    <w:rFonts w:cstheme="minorHAnsi"/>
+                  </w:rPr>
+                  <w:t>Improved some of the English, no behaviour changes</w:t>
+                </w:r>
+              </w:p>
+            </w:tc>
+          </w:tr>
         </w:tbl>
         <w:p>
           <w:pPr>
@@ -2122,7 +2160,7 @@
           <w:r>
             <w:fldChar w:fldCharType="separate"/>
           </w:r>
-          <w:hyperlink w:anchor="_Toc234053652" w:history="1">
+          <w:hyperlink w:anchor="_Toc234059598" w:history="1">
             <w:r>
               <w:rPr>
                 <w:rStyle w:val="Hyperlink"/>
@@ -2168,7 +2206,7 @@
                 <w:noProof/>
                 <w:webHidden/>
               </w:rPr>
-              <w:instrText xml:space="preserve"> PAGEREF _Toc234053652 \h </w:instrText>
+              <w:instrText xml:space="preserve"> PAGEREF _Toc234059598 \h </w:instrText>
             </w:r>
             <w:r>
               <w:rPr>
@@ -2212,7 +2250,7 @@
               <w:lang w:eastAsia="en-GB"/>
             </w:rPr>
           </w:pPr>
-          <w:hyperlink w:anchor="_Toc234053653" w:history="1">
+          <w:hyperlink w:anchor="_Toc234059599" w:history="1">
             <w:r>
               <w:rPr>
                 <w:rStyle w:val="Hyperlink"/>
@@ -2256,7 +2294,7 @@
                 <w:noProof/>
                 <w:webHidden/>
               </w:rPr>
-              <w:instrText xml:space="preserve"> PAGEREF _Toc234053653 \h </w:instrText>
+              <w:instrText xml:space="preserve"> PAGEREF _Toc234059599 \h </w:instrText>
             </w:r>
             <w:r>
               <w:rPr>
@@ -2300,7 +2338,7 @@
               <w:lang w:eastAsia="en-GB"/>
             </w:rPr>
           </w:pPr>
-          <w:hyperlink w:anchor="_Toc234053654" w:history="1">
+          <w:hyperlink w:anchor="_Toc234059600" w:history="1">
             <w:r>
               <w:rPr>
                 <w:rStyle w:val="Hyperlink"/>
@@ -2342,7 +2380,7 @@
                 <w:noProof/>
                 <w:webHidden/>
               </w:rPr>
-              <w:instrText xml:space="preserve"> PAGEREF _Toc234053654 \h </w:instrText>
+              <w:instrText xml:space="preserve"> PAGEREF _Toc234059600 \h </w:instrText>
             </w:r>
             <w:r>
               <w:rPr>
@@ -2386,7 +2424,7 @@
               <w:lang w:eastAsia="en-GB"/>
             </w:rPr>
           </w:pPr>
-          <w:hyperlink w:anchor="_Toc234053655" w:history="1">
+          <w:hyperlink w:anchor="_Toc234059601" w:history="1">
             <w:r>
               <w:rPr>
                 <w:rStyle w:val="Hyperlink"/>
@@ -2428,7 +2466,7 @@
                 <w:noProof/>
                 <w:webHidden/>
               </w:rPr>
-              <w:instrText xml:space="preserve"> PAGEREF _Toc234053655 \h </w:instrText>
+              <w:instrText xml:space="preserve"> PAGEREF _Toc234059601 \h </w:instrText>
             </w:r>
             <w:r>
               <w:rPr>
@@ -2472,7 +2510,7 @@
               <w:lang w:eastAsia="en-GB"/>
             </w:rPr>
           </w:pPr>
-          <w:hyperlink w:anchor="_Toc234053656" w:history="1">
+          <w:hyperlink w:anchor="_Toc234059602" w:history="1">
             <w:r>
               <w:rPr>
                 <w:rStyle w:val="Hyperlink"/>
@@ -2514,7 +2552,7 @@
                 <w:noProof/>
                 <w:webHidden/>
               </w:rPr>
-              <w:instrText xml:space="preserve"> PAGEREF _Toc234053656 \h </w:instrText>
+              <w:instrText xml:space="preserve"> PAGEREF _Toc234059602 \h </w:instrText>
             </w:r>
             <w:r>
               <w:rPr>
@@ -2558,7 +2596,7 @@
               <w:lang w:eastAsia="en-GB"/>
             </w:rPr>
           </w:pPr>
-          <w:hyperlink w:anchor="_Toc234053657" w:history="1">
+          <w:hyperlink w:anchor="_Toc234059603" w:history="1">
             <w:r>
               <w:rPr>
                 <w:rStyle w:val="Hyperlink"/>
@@ -2600,7 +2638,7 @@
                 <w:noProof/>
                 <w:webHidden/>
               </w:rPr>
-              <w:instrText xml:space="preserve"> PAGEREF _Toc234053657 \h </w:instrText>
+              <w:instrText xml:space="preserve"> PAGEREF _Toc234059603 \h </w:instrText>
             </w:r>
             <w:r>
               <w:rPr>
@@ -2644,7 +2682,7 @@
               <w:lang w:eastAsia="en-GB"/>
             </w:rPr>
           </w:pPr>
-          <w:hyperlink w:anchor="_Toc234053658" w:history="1">
+          <w:hyperlink w:anchor="_Toc234059604" w:history="1">
             <w:r>
               <w:rPr>
                 <w:rStyle w:val="Hyperlink"/>
@@ -2686,7 +2724,7 @@
                 <w:noProof/>
                 <w:webHidden/>
               </w:rPr>
-              <w:instrText xml:space="preserve"> PAGEREF _Toc234053658 \h </w:instrText>
+              <w:instrText xml:space="preserve"> PAGEREF _Toc234059604 \h </w:instrText>
             </w:r>
             <w:r>
               <w:rPr>
@@ -2730,7 +2768,7 @@
               <w:lang w:eastAsia="en-GB"/>
             </w:rPr>
           </w:pPr>
-          <w:hyperlink w:anchor="_Toc234053659" w:history="1">
+          <w:hyperlink w:anchor="_Toc234059605" w:history="1">
             <w:r>
               <w:rPr>
                 <w:rStyle w:val="Hyperlink"/>
@@ -2774,7 +2812,7 @@
                 <w:noProof/>
                 <w:webHidden/>
               </w:rPr>
-              <w:instrText xml:space="preserve"> PAGEREF _Toc234053659 \h </w:instrText>
+              <w:instrText xml:space="preserve"> PAGEREF _Toc234059605 \h </w:instrText>
             </w:r>
             <w:r>
               <w:rPr>
@@ -2818,7 +2856,7 @@
               <w:lang w:eastAsia="en-GB"/>
             </w:rPr>
           </w:pPr>
-          <w:hyperlink w:anchor="_Toc234053660" w:history="1">
+          <w:hyperlink w:anchor="_Toc234059606" w:history="1">
             <w:r>
               <w:rPr>
                 <w:rStyle w:val="Hyperlink"/>
@@ -2862,7 +2900,7 @@
                 <w:noProof/>
                 <w:webHidden/>
               </w:rPr>
-              <w:instrText xml:space="preserve"> PAGEREF _Toc234053660 \h </w:instrText>
+              <w:instrText xml:space="preserve"> PAGEREF _Toc234059606 \h </w:instrText>
             </w:r>
             <w:r>
               <w:rPr>
@@ -2906,7 +2944,7 @@
               <w:lang w:eastAsia="en-GB"/>
             </w:rPr>
           </w:pPr>
-          <w:hyperlink w:anchor="_Toc234053661" w:history="1">
+          <w:hyperlink w:anchor="_Toc234059607" w:history="1">
             <w:r>
               <w:rPr>
                 <w:rStyle w:val="Hyperlink"/>
@@ -2950,7 +2988,7 @@
                 <w:noProof/>
                 <w:webHidden/>
               </w:rPr>
-              <w:instrText xml:space="preserve"> PAGEREF _Toc234053661 \h </w:instrText>
+              <w:instrText xml:space="preserve"> PAGEREF _Toc234059607 \h </w:instrText>
             </w:r>
             <w:r>
               <w:rPr>
@@ -2994,7 +3032,7 @@
               <w:lang w:eastAsia="en-GB"/>
             </w:rPr>
           </w:pPr>
-          <w:hyperlink w:anchor="_Toc234053662" w:history="1">
+          <w:hyperlink w:anchor="_Toc234059608" w:history="1">
             <w:r>
               <w:rPr>
                 <w:rStyle w:val="Hyperlink"/>
@@ -3038,7 +3076,7 @@
                 <w:noProof/>
                 <w:webHidden/>
               </w:rPr>
-              <w:instrText xml:space="preserve"> PAGEREF _Toc234053662 \h </w:instrText>
+              <w:instrText xml:space="preserve"> PAGEREF _Toc234059608 \h </w:instrText>
             </w:r>
             <w:r>
               <w:rPr>
@@ -3082,7 +3120,7 @@
               <w:lang w:eastAsia="en-GB"/>
             </w:rPr>
           </w:pPr>
-          <w:hyperlink w:anchor="_Toc234053663" w:history="1">
+          <w:hyperlink w:anchor="_Toc234059609" w:history="1">
             <w:r>
               <w:rPr>
                 <w:rStyle w:val="Hyperlink"/>
@@ -3126,7 +3164,7 @@
                 <w:noProof/>
                 <w:webHidden/>
               </w:rPr>
-              <w:instrText xml:space="preserve"> PAGEREF _Toc234053663 \h </w:instrText>
+              <w:instrText xml:space="preserve"> PAGEREF _Toc234059609 \h </w:instrText>
             </w:r>
             <w:r>
               <w:rPr>
@@ -3170,7 +3208,7 @@
               <w:lang w:eastAsia="en-GB"/>
             </w:rPr>
           </w:pPr>
-          <w:hyperlink w:anchor="_Toc234053664" w:history="1">
+          <w:hyperlink w:anchor="_Toc234059610" w:history="1">
             <w:r>
               <w:rPr>
                 <w:rStyle w:val="Hyperlink"/>
@@ -3214,7 +3252,7 @@
                 <w:noProof/>
                 <w:webHidden/>
               </w:rPr>
-              <w:instrText xml:space="preserve"> PAGEREF _Toc234053664 \h </w:instrText>
+              <w:instrText xml:space="preserve"> PAGEREF _Toc234059610 \h </w:instrText>
             </w:r>
             <w:r>
               <w:rPr>
@@ -3258,7 +3296,7 @@
               <w:lang w:eastAsia="en-GB"/>
             </w:rPr>
           </w:pPr>
-          <w:hyperlink w:anchor="_Toc234053665" w:history="1">
+          <w:hyperlink w:anchor="_Toc234059611" w:history="1">
             <w:r>
               <w:rPr>
                 <w:rStyle w:val="Hyperlink"/>
@@ -3302,7 +3340,7 @@
                 <w:noProof/>
                 <w:webHidden/>
               </w:rPr>
-              <w:instrText xml:space="preserve"> PAGEREF _Toc234053665 \h </w:instrText>
+              <w:instrText xml:space="preserve"> PAGEREF _Toc234059611 \h </w:instrText>
             </w:r>
             <w:r>
               <w:rPr>
@@ -3346,7 +3384,7 @@
               <w:lang w:eastAsia="en-GB"/>
             </w:rPr>
           </w:pPr>
-          <w:hyperlink w:anchor="_Toc234053666" w:history="1">
+          <w:hyperlink w:anchor="_Toc234059612" w:history="1">
             <w:r>
               <w:rPr>
                 <w:rStyle w:val="Hyperlink"/>
@@ -3390,7 +3428,7 @@
                 <w:noProof/>
                 <w:webHidden/>
               </w:rPr>
-              <w:instrText xml:space="preserve"> PAGEREF _Toc234053666 \h </w:instrText>
+              <w:instrText xml:space="preserve"> PAGEREF _Toc234059612 \h </w:instrText>
             </w:r>
             <w:r>
               <w:rPr>
@@ -3434,7 +3472,7 @@
               <w:lang w:eastAsia="en-GB"/>
             </w:rPr>
           </w:pPr>
-          <w:hyperlink w:anchor="_Toc234053667" w:history="1">
+          <w:hyperlink w:anchor="_Toc234059613" w:history="1">
             <w:r>
               <w:rPr>
                 <w:rStyle w:val="Hyperlink"/>
@@ -3478,7 +3516,7 @@
                 <w:noProof/>
                 <w:webHidden/>
               </w:rPr>
-              <w:instrText xml:space="preserve"> PAGEREF _Toc234053667 \h </w:instrText>
+              <w:instrText xml:space="preserve"> PAGEREF _Toc234059613 \h </w:instrText>
             </w:r>
             <w:r>
               <w:rPr>
@@ -3522,7 +3560,7 @@
               <w:lang w:eastAsia="en-GB"/>
             </w:rPr>
           </w:pPr>
-          <w:hyperlink w:anchor="_Toc234053668" w:history="1">
+          <w:hyperlink w:anchor="_Toc234059614" w:history="1">
             <w:r>
               <w:rPr>
                 <w:rStyle w:val="Hyperlink"/>
@@ -3566,7 +3604,7 @@
                 <w:noProof/>
                 <w:webHidden/>
               </w:rPr>
-              <w:instrText xml:space="preserve"> PAGEREF _Toc234053668 \h </w:instrText>
+              <w:instrText xml:space="preserve"> PAGEREF _Toc234059614 \h </w:instrText>
             </w:r>
             <w:r>
               <w:rPr>
@@ -3610,7 +3648,7 @@
               <w:lang w:eastAsia="en-GB"/>
             </w:rPr>
           </w:pPr>
-          <w:hyperlink w:anchor="_Toc234053669" w:history="1">
+          <w:hyperlink w:anchor="_Toc234059615" w:history="1">
             <w:r>
               <w:rPr>
                 <w:rStyle w:val="Hyperlink"/>
@@ -3654,7 +3692,7 @@
                 <w:noProof/>
                 <w:webHidden/>
               </w:rPr>
-              <w:instrText xml:space="preserve"> PAGEREF _Toc234053669 \h </w:instrText>
+              <w:instrText xml:space="preserve"> PAGEREF _Toc234059615 \h </w:instrText>
             </w:r>
             <w:r>
               <w:rPr>
@@ -3698,7 +3736,7 @@
               <w:lang w:eastAsia="en-GB"/>
             </w:rPr>
           </w:pPr>
-          <w:hyperlink w:anchor="_Toc234053670" w:history="1">
+          <w:hyperlink w:anchor="_Toc234059616" w:history="1">
             <w:r>
               <w:rPr>
                 <w:rStyle w:val="Hyperlink"/>
@@ -3742,7 +3780,7 @@
                 <w:noProof/>
                 <w:webHidden/>
               </w:rPr>
-              <w:instrText xml:space="preserve"> PAGEREF _Toc234053670 \h </w:instrText>
+              <w:instrText xml:space="preserve"> PAGEREF _Toc234059616 \h </w:instrText>
             </w:r>
             <w:r>
               <w:rPr>
@@ -3786,7 +3824,7 @@
               <w:lang w:eastAsia="en-GB"/>
             </w:rPr>
           </w:pPr>
-          <w:hyperlink w:anchor="_Toc234053671" w:history="1">
+          <w:hyperlink w:anchor="_Toc234059617" w:history="1">
             <w:r>
               <w:rPr>
                 <w:rStyle w:val="Hyperlink"/>
@@ -3830,7 +3868,7 @@
                 <w:noProof/>
                 <w:webHidden/>
               </w:rPr>
-              <w:instrText xml:space="preserve"> PAGEREF _Toc234053671 \h </w:instrText>
+              <w:instrText xml:space="preserve"> PAGEREF _Toc234059617 \h </w:instrText>
             </w:r>
             <w:r>
               <w:rPr>
@@ -3939,7 +3977,7 @@
         </w:rPr>
         <w:fldChar w:fldCharType="separate"/>
       </w:r>
-      <w:hyperlink w:anchor="_Toc234053672" w:history="1">
+      <w:hyperlink w:anchor="_Toc234059618" w:history="1">
         <w:r>
           <w:rPr>
             <w:rStyle w:val="Hyperlink"/>
@@ -3966,7 +4004,7 @@
             <w:noProof/>
             <w:webHidden/>
           </w:rPr>
-          <w:instrText xml:space="preserve"> PAGEREF _Toc234053672 \h </w:instrText>
+          <w:instrText xml:space="preserve"> PAGEREF _Toc234059618 \h </w:instrText>
         </w:r>
         <w:r>
           <w:rPr>
@@ -4009,7 +4047,7 @@
           <w:lang w:eastAsia="en-GB"/>
         </w:rPr>
       </w:pPr>
-      <w:hyperlink w:anchor="_Toc234053673" w:history="1">
+      <w:hyperlink w:anchor="_Toc234059619" w:history="1">
         <w:r>
           <w:rPr>
             <w:rStyle w:val="Hyperlink"/>
@@ -4036,7 +4074,7 @@
             <w:noProof/>
             <w:webHidden/>
           </w:rPr>
-          <w:instrText xml:space="preserve"> PAGEREF _Toc234053673 \h </w:instrText>
+          <w:instrText xml:space="preserve"> PAGEREF _Toc234059619 \h </w:instrText>
         </w:r>
         <w:r>
           <w:rPr>
@@ -4116,7 +4154,7 @@
           <w:lang w:eastAsia="en-GB"/>
         </w:rPr>
       </w:pPr>
-      <w:bookmarkStart w:id="2" w:name="_Toc234053652"/>
+      <w:bookmarkStart w:id="2" w:name="_Toc234059598"/>
       <w:bookmarkEnd w:id="1"/>
       <w:r>
         <w:rPr>
@@ -4167,7 +4205,7 @@
           <w:lang w:eastAsia="en-GB"/>
         </w:rPr>
       </w:pPr>
-      <w:bookmarkStart w:id="3" w:name="_Toc234053653"/>
+      <w:bookmarkStart w:id="3" w:name="_Toc234059599"/>
       <w:r>
         <w:rPr>
           <w:lang w:eastAsia="en-GB"/>
@@ -4308,7 +4346,7 @@
         <w:jc w:val="center"/>
       </w:pPr>
       <w:bookmarkStart w:id="4" w:name="_Ref232073454"/>
-      <w:bookmarkStart w:id="5" w:name="_Toc234053672"/>
+      <w:bookmarkStart w:id="5" w:name="_Toc234059618"/>
       <w:r>
         <w:t xml:space="preserve">Figure </w:t>
       </w:r>
@@ -4728,7 +4766,7 @@
         <w:pStyle w:val="Heading2"/>
       </w:pPr>
       <w:bookmarkStart w:id="6" w:name="_Ref233631401"/>
-      <w:bookmarkStart w:id="7" w:name="_Toc234053654"/>
+      <w:bookmarkStart w:id="7" w:name="_Toc234059600"/>
       <w:r>
         <w:lastRenderedPageBreak/>
         <w:t xml:space="preserve">Overview of </w:t>
@@ -4866,7 +4904,7 @@
         <w:jc w:val="center"/>
       </w:pPr>
       <w:bookmarkStart w:id="8" w:name="_Ref233626426"/>
-      <w:bookmarkStart w:id="9" w:name="_Toc234053673"/>
+      <w:bookmarkStart w:id="9" w:name="_Toc234059619"/>
       <w:r>
         <w:t xml:space="preserve">Figure </w:t>
       </w:r>
@@ -4886,7 +4924,10 @@
     </w:p>
     <w:p>
       <w:r>
-        <w:t xml:space="preserve">In the following text: “signals” are all the named signals in </w:t>
+        <w:t xml:space="preserve">All of the signals shown </w:t>
+      </w:r>
+      <w:r>
+        <w:t xml:space="preserve">in </w:t>
       </w:r>
       <w:r>
         <w:fldChar w:fldCharType="begin"/>
@@ -4910,12 +4951,45 @@
         <w:fldChar w:fldCharType="end"/>
       </w:r>
       <w:r>
-        <w:t xml:space="preserve"> excluding CLOCK.</w:t>
-      </w:r>
-    </w:p>
-    <w:p>
-      <w:r>
-        <w:t xml:space="preserve">The signals shown in </w:t>
+        <w:t xml:space="preserve"> </w:t>
+      </w:r>
+      <w:r>
+        <w:t xml:space="preserve">are provided by the IS (Instruction Decode &amp; Sequence Control) block shown in </w:t>
+      </w:r>
+      <w:r>
+        <w:fldChar w:fldCharType="begin"/>
+      </w:r>
+      <w:r>
+        <w:instrText xml:space="preserve"> REF _Ref232073454 \h </w:instrText>
+      </w:r>
+      <w:r>
+        <w:fldChar w:fldCharType="separate"/>
+      </w:r>
+      <w:r>
+        <w:t xml:space="preserve">Figure </w:t>
+      </w:r>
+      <w:r>
+        <w:rPr>
+          <w:noProof/>
+        </w:rPr>
+        <w:t>1</w:t>
+      </w:r>
+      <w:r>
+        <w:fldChar w:fldCharType="end"/>
+      </w:r>
+      <w:r>
+        <w:t xml:space="preserve"> </w:t>
+      </w:r>
+      <w:r>
+        <w:t>.</w:t>
+      </w:r>
+    </w:p>
+    <w:p>
+      <w:r>
+        <w:t>The lower 3 signals</w:t>
+      </w:r>
+      <w:r>
+        <w:t xml:space="preserve"> shown in </w:t>
       </w:r>
       <w:r>
         <w:fldChar w:fldCharType="begin"/>
@@ -5119,16 +5193,28 @@
         </w:numPr>
       </w:pPr>
       <w:r>
-        <w:t xml:space="preserve">The selected destination should read the value from DBUS on the </w:t>
-      </w:r>
-      <w:r>
-        <w:t>falling</w:t>
-      </w:r>
-      <w:r>
-        <w:t xml:space="preserve"> edge of </w:t>
-      </w:r>
-      <w:r>
-        <w:t>SELECT &lt;DESTINATION&gt;</w:t>
+        <w:t>The selec</w:t>
+      </w:r>
+      <w:r>
+        <w:t xml:space="preserve">ted destination should read from DBUS whilst the data is valid (see </w:t>
+      </w:r>
+      <w:r>
+        <w:fldChar w:fldCharType="begin"/>
+      </w:r>
+      <w:r>
+        <w:instrText xml:space="preserve"> REF _Ref232850548 \r \h </w:instrText>
+      </w:r>
+      <w:r>
+        <w:fldChar w:fldCharType="separate"/>
+      </w:r>
+      <w:r>
+        <w:t>2.1.1</w:t>
+      </w:r>
+      <w:r>
+        <w:fldChar w:fldCharType="end"/>
+      </w:r>
+      <w:r>
+        <w:t>).</w:t>
       </w:r>
     </w:p>
     <w:p>
@@ -5209,7 +5295,7 @@
         <w:pStyle w:val="Heading3"/>
       </w:pPr>
       <w:bookmarkStart w:id="10" w:name="_Ref232850548"/>
-      <w:bookmarkStart w:id="11" w:name="_Toc234053655"/>
+      <w:bookmarkStart w:id="11" w:name="_Toc234059601"/>
       <w:r>
         <w:lastRenderedPageBreak/>
         <w:t>Reading f</w:t>
@@ -5244,7 +5330,13 @@
         </w:rPr>
       </w:pPr>
       <w:r>
-        <w:t>Select signals names are the form “</w:t>
+        <w:t xml:space="preserve">Select </w:t>
+      </w:r>
+      <w:r>
+        <w:t>signal</w:t>
+      </w:r>
+      <w:r>
+        <w:t xml:space="preserve"> names are the form “</w:t>
       </w:r>
       <w:r>
         <w:rPr>
@@ -5381,51 +5473,7 @@
         <w:rPr>
           <w:lang w:eastAsia="en-GB"/>
         </w:rPr>
-        <w:t xml:space="preserve">The IS controls what is reading from the data bus. The IS may read from the data bus. The relevant SELECT signals are internal to the IS block. Hence they are not shown in </w:t>
-      </w:r>
-      <w:r>
-        <w:rPr>
-          <w:lang w:eastAsia="en-GB"/>
-        </w:rPr>
-        <w:fldChar w:fldCharType="begin"/>
-      </w:r>
-      <w:r>
-        <w:rPr>
-          <w:lang w:eastAsia="en-GB"/>
-        </w:rPr>
-        <w:instrText xml:space="preserve"> REF _Ref232073454 \h </w:instrText>
-      </w:r>
-      <w:r>
-        <w:rPr>
-          <w:lang w:eastAsia="en-GB"/>
-        </w:rPr>
-      </w:r>
-      <w:r>
-        <w:rPr>
-          <w:lang w:eastAsia="en-GB"/>
-        </w:rPr>
-        <w:fldChar w:fldCharType="separate"/>
-      </w:r>
-      <w:r>
-        <w:t xml:space="preserve">Figure </w:t>
-      </w:r>
-      <w:r>
-        <w:rPr>
-          <w:noProof/>
-        </w:rPr>
-        <w:t>1</w:t>
-      </w:r>
-      <w:r>
-        <w:rPr>
-          <w:lang w:eastAsia="en-GB"/>
-        </w:rPr>
-        <w:fldChar w:fldCharType="end"/>
-      </w:r>
-      <w:r>
-        <w:rPr>
-          <w:lang w:eastAsia="en-GB"/>
-        </w:rPr>
-        <w:t>.</w:t>
+        <w:t>The IS controls what is reading from the data bus.</w:t>
       </w:r>
     </w:p>
     <w:p>
@@ -5657,7 +5705,7 @@
       <w:bookmarkStart w:id="14" w:name="_Ref233721180"/>
       <w:bookmarkStart w:id="15" w:name="_Ref233721252"/>
       <w:bookmarkStart w:id="16" w:name="_Ref233721322"/>
-      <w:bookmarkStart w:id="17" w:name="_Toc234053656"/>
+      <w:bookmarkStart w:id="17" w:name="_Toc234059602"/>
       <w:r>
         <w:t>Writing t</w:t>
       </w:r>
@@ -5689,7 +5737,7 @@
         </w:rPr>
       </w:pPr>
       <w:r>
-        <w:t>Select signals names are the form “</w:t>
+        <w:t>Select signal names are the form “</w:t>
       </w:r>
       <w:r>
         <w:rPr>
@@ -5785,51 +5833,7 @@
         <w:rPr>
           <w:lang w:eastAsia="en-GB"/>
         </w:rPr>
-        <w:t xml:space="preserve">The IS controls what is writing to the data bus. The IS may write to the data bus. The relevant SELECT signals are internal to the IS block. Hence they are not shown in </w:t>
-      </w:r>
-      <w:r>
-        <w:rPr>
-          <w:lang w:eastAsia="en-GB"/>
-        </w:rPr>
-        <w:fldChar w:fldCharType="begin"/>
-      </w:r>
-      <w:r>
-        <w:rPr>
-          <w:lang w:eastAsia="en-GB"/>
-        </w:rPr>
-        <w:instrText xml:space="preserve"> REF _Ref232073454 \h </w:instrText>
-      </w:r>
-      <w:r>
-        <w:rPr>
-          <w:lang w:eastAsia="en-GB"/>
-        </w:rPr>
-      </w:r>
-      <w:r>
-        <w:rPr>
-          <w:lang w:eastAsia="en-GB"/>
-        </w:rPr>
-        <w:fldChar w:fldCharType="separate"/>
-      </w:r>
-      <w:r>
-        <w:t xml:space="preserve">Figure </w:t>
-      </w:r>
-      <w:r>
-        <w:rPr>
-          <w:noProof/>
-        </w:rPr>
-        <w:t>1</w:t>
-      </w:r>
-      <w:r>
-        <w:rPr>
-          <w:lang w:eastAsia="en-GB"/>
-        </w:rPr>
-        <w:fldChar w:fldCharType="end"/>
-      </w:r>
-      <w:r>
-        <w:rPr>
-          <w:lang w:eastAsia="en-GB"/>
-        </w:rPr>
-        <w:t>.</w:t>
+        <w:t>The IS controls what is writing to the data bus.</w:t>
       </w:r>
     </w:p>
     <w:p>
@@ -6013,7 +6017,7 @@
         <w:pStyle w:val="Heading2"/>
       </w:pPr>
       <w:bookmarkStart w:id="18" w:name="_Ref232849573"/>
-      <w:bookmarkStart w:id="19" w:name="_Toc234053657"/>
+      <w:bookmarkStart w:id="19" w:name="_Toc234059603"/>
       <w:r>
         <w:t>Overview of GP and SP registers</w:t>
       </w:r>
@@ -6042,7 +6046,7 @@
       </w:pPr>
       <w:bookmarkStart w:id="20" w:name="_Ref232926928"/>
       <w:bookmarkStart w:id="21" w:name="_Ref232926933"/>
-      <w:bookmarkStart w:id="22" w:name="_Toc234053658"/>
+      <w:bookmarkStart w:id="22" w:name="_Toc234059604"/>
       <w:r>
         <w:t>SP Behaviour</w:t>
       </w:r>
@@ -6165,7 +6169,7 @@
         </w:rPr>
       </w:pPr>
       <w:bookmarkStart w:id="23" w:name="_Ref172648415"/>
-      <w:bookmarkStart w:id="24" w:name="_Toc234053659"/>
+      <w:bookmarkStart w:id="24" w:name="_Toc234059605"/>
       <w:r>
         <w:rPr>
           <w:lang w:eastAsia="en-GB"/>
@@ -6874,7 +6878,7 @@
       <w:bookmarkStart w:id="26" w:name="_Ref232084946"/>
       <w:bookmarkStart w:id="27" w:name="_Ref232086890"/>
       <w:bookmarkStart w:id="28" w:name="_Ref232086990"/>
-      <w:bookmarkStart w:id="29" w:name="_Toc234053660"/>
+      <w:bookmarkStart w:id="29" w:name="_Toc234059606"/>
       <w:r>
         <w:rPr>
           <w:lang w:eastAsia="en-GB"/>
@@ -7036,7 +7040,7 @@
         </w:rPr>
       </w:pPr>
       <w:bookmarkStart w:id="30" w:name="_Ref232081276"/>
-      <w:bookmarkStart w:id="31" w:name="_Toc234053661"/>
+      <w:bookmarkStart w:id="31" w:name="_Toc234059607"/>
       <w:r>
         <w:rPr>
           <w:lang w:eastAsia="en-GB"/>
@@ -7067,7 +7071,7 @@
         </w:rPr>
       </w:pPr>
       <w:bookmarkStart w:id="32" w:name="_Ref232081291"/>
-      <w:bookmarkStart w:id="33" w:name="_Toc234053662"/>
+      <w:bookmarkStart w:id="33" w:name="_Toc234059608"/>
       <w:r>
         <w:rPr>
           <w:lang w:eastAsia="en-GB"/>
@@ -7100,7 +7104,7 @@
         </w:rPr>
       </w:pPr>
       <w:bookmarkStart w:id="35" w:name="_Ref233021496"/>
-      <w:bookmarkStart w:id="36" w:name="_Toc234053663"/>
+      <w:bookmarkStart w:id="36" w:name="_Toc234059609"/>
       <w:r>
         <w:rPr>
           <w:lang w:eastAsia="en-GB"/>
@@ -7657,7 +7661,7 @@
         </w:rPr>
       </w:pPr>
       <w:bookmarkStart w:id="38" w:name="_Ref232090743"/>
-      <w:bookmarkStart w:id="39" w:name="_Toc234053664"/>
+      <w:bookmarkStart w:id="39" w:name="_Toc234059610"/>
       <w:r>
         <w:rPr>
           <w:lang w:eastAsia="en-GB"/>
@@ -7711,7 +7715,31 @@
         <w:rPr>
           <w:lang w:eastAsia="en-GB"/>
         </w:rPr>
-        <w:t xml:space="preserve"> :    Ra = port number to read. Rb is set to value read from </w:t>
+        <w:t xml:space="preserve"> :    Ra = port number to read</w:t>
+      </w:r>
+      <w:r>
+        <w:rPr>
+          <w:lang w:eastAsia="en-GB"/>
+        </w:rPr>
+        <w:t xml:space="preserve"> from</w:t>
+      </w:r>
+      <w:r>
+        <w:rPr>
+          <w:lang w:eastAsia="en-GB"/>
+        </w:rPr>
+        <w:t xml:space="preserve">. Rb is set to </w:t>
+      </w:r>
+      <w:r>
+        <w:rPr>
+          <w:lang w:eastAsia="en-GB"/>
+        </w:rPr>
+        <w:t xml:space="preserve">the </w:t>
+      </w:r>
+      <w:r>
+        <w:rPr>
+          <w:lang w:eastAsia="en-GB"/>
+        </w:rPr>
+        <w:t xml:space="preserve">value read from </w:t>
       </w:r>
       <w:r>
         <w:rPr>
@@ -7755,7 +7783,19 @@
         <w:rPr>
           <w:lang w:eastAsia="en-GB"/>
         </w:rPr>
-        <w:t>: Ra = port number to write.</w:t>
+        <w:t>: Ra = port number to write</w:t>
+      </w:r>
+      <w:r>
+        <w:rPr>
+          <w:lang w:eastAsia="en-GB"/>
+        </w:rPr>
+        <w:t xml:space="preserve"> to</w:t>
+      </w:r>
+      <w:r>
+        <w:rPr>
+          <w:lang w:eastAsia="en-GB"/>
+        </w:rPr>
+        <w:t>.</w:t>
       </w:r>
       <w:r>
         <w:rPr>
@@ -8148,7 +8188,7 @@
         </w:rPr>
       </w:pPr>
       <w:bookmarkStart w:id="41" w:name="_Ref232090753"/>
-      <w:bookmarkStart w:id="42" w:name="_Toc234053665"/>
+      <w:bookmarkStart w:id="42" w:name="_Toc234059611"/>
       <w:r>
         <w:rPr>
           <w:lang w:eastAsia="en-GB"/>
@@ -8525,7 +8565,7 @@
         </w:rPr>
       </w:pPr>
       <w:bookmarkStart w:id="43" w:name="_Ref233191365"/>
-      <w:bookmarkStart w:id="44" w:name="_Toc234053666"/>
+      <w:bookmarkStart w:id="44" w:name="_Toc234059612"/>
       <w:r>
         <w:rPr>
           <w:lang w:eastAsia="en-GB"/>
@@ -8559,7 +8599,19 @@
         <w:rPr>
           <w:lang w:eastAsia="en-GB"/>
         </w:rPr>
-        <w:t xml:space="preserve"> RAM). If the size is &lt; 64K </w:t>
+        <w:t xml:space="preserve"> RAM). If the size is &lt; 64K</w:t>
+      </w:r>
+      <w:r>
+        <w:rPr>
+          <w:lang w:eastAsia="en-GB"/>
+        </w:rPr>
+        <w:t>, then</w:t>
+      </w:r>
+      <w:r>
+        <w:rPr>
+          <w:lang w:eastAsia="en-GB"/>
+        </w:rPr>
+        <w:t xml:space="preserve"> </w:t>
       </w:r>
       <w:proofErr w:type="gramStart"/>
       <w:r>
@@ -8635,7 +8687,7 @@
         </w:rPr>
       </w:pPr>
       <w:bookmarkStart w:id="46" w:name="_Ref232851000"/>
-      <w:bookmarkStart w:id="47" w:name="_Toc234053667"/>
+      <w:bookmarkStart w:id="47" w:name="_Toc234059613"/>
       <w:r>
         <w:rPr>
           <w:lang w:eastAsia="en-GB"/>
@@ -10385,7 +10437,7 @@
         </w:rPr>
       </w:pPr>
       <w:bookmarkStart w:id="55" w:name="_Ref232090831"/>
-      <w:bookmarkStart w:id="56" w:name="_Toc234053668"/>
+      <w:bookmarkStart w:id="56" w:name="_Toc234059614"/>
       <w:r>
         <w:rPr>
           <w:lang w:eastAsia="en-GB"/>
@@ -10413,7 +10465,7 @@
         <w:rPr>
           <w:lang w:eastAsia="en-GB"/>
         </w:rPr>
-        <w:t xml:space="preserve"> These signals are used by the Instruction Sequencer to decide whether conditional jumps should be followed or skipped.</w:t>
+        <w:t xml:space="preserve"> These signals are used by the IS to decide whether conditional jumps should be followed or skipped.</w:t>
       </w:r>
     </w:p>
     <w:p>
@@ -10743,7 +10795,7 @@
           <w:lang w:eastAsia="en-GB"/>
         </w:rPr>
       </w:pPr>
-      <w:bookmarkStart w:id="57" w:name="_Toc234053669"/>
+      <w:bookmarkStart w:id="57" w:name="_Toc234059615"/>
       <w:r>
         <w:rPr>
           <w:lang w:eastAsia="en-GB"/>
@@ -10914,7 +10966,7 @@
           <w:lang w:eastAsia="en-GB"/>
         </w:rPr>
       </w:pPr>
-      <w:bookmarkStart w:id="58" w:name="_Toc234053670"/>
+      <w:bookmarkStart w:id="58" w:name="_Toc234059616"/>
       <w:r>
         <w:rPr>
           <w:lang w:eastAsia="en-GB"/>
@@ -12445,7 +12497,7 @@
           <w:lang w:eastAsia="en-GB"/>
         </w:rPr>
       </w:pPr>
-      <w:bookmarkStart w:id="64" w:name="_Toc234053671"/>
+      <w:bookmarkStart w:id="64" w:name="_Toc234059617"/>
       <w:r>
         <w:rPr>
           <w:lang w:eastAsia="en-GB"/>
@@ -12680,7 +12732,7 @@
               <w:b/>
               <w:noProof/>
             </w:rPr>
-            <w:t>ii</w:t>
+            <w:t>8</w:t>
           </w:r>
         </w:fldSimple>
       </w:p>
@@ -17173,7 +17225,7 @@
 </file>
 
 <file path=customXml/itemProps2.xml><?xml version="1.0" encoding="utf-8"?>
-<ds:datastoreItem xmlns:ds="http://schemas.openxmlformats.org/officeDocument/2006/customXml" ds:itemID="{893E6A52-2A2A-446A-A924-4D4FE84B9925}">
+<ds:datastoreItem xmlns:ds="http://schemas.openxmlformats.org/officeDocument/2006/customXml" ds:itemID="{952BE7A6-2560-48EC-820E-2F9456F37CE3}">
   <ds:schemaRefs>
     <ds:schemaRef ds:uri="http://schemas.openxmlformats.org/officeDocument/2006/bibliography"/>
   </ds:schemaRefs>

</xml_diff>

<commit_message>
Fix type and edit naming of IS to be consistent
Fixed a typo. Last word of 2.1.1 changed from “low” to “high”
</commit_message>
<xml_diff>
--- a/CPU Design/CpuDesign.docx
+++ b/CPU Design/CpuDesign.docx
@@ -882,7 +882,7 @@
                   <w:rPr>
                     <w:rFonts w:cstheme="minorHAnsi"/>
                   </w:rPr>
-                  <w:instrText xml:space="preserve"> REF _Ref232850548 \r \h </w:instrText>
+                  <w:instrText xml:space="preserve"> REF _Ref234067859 \r \h </w:instrText>
                 </w:r>
                 <w:r>
                   <w:rPr>
@@ -1699,7 +1699,7 @@
                   <w:rPr>
                     <w:rFonts w:cstheme="minorHAnsi"/>
                   </w:rPr>
-                  <w:instrText xml:space="preserve"> REF _Ref232850548 \r \h </w:instrText>
+                  <w:instrText xml:space="preserve"> REF _Ref234067859 \r \h </w:instrText>
                 </w:r>
                 <w:r>
                   <w:rPr>
@@ -2088,6 +2088,98 @@
                     <w:rFonts w:cstheme="minorHAnsi"/>
                   </w:rPr>
                   <w:t>Improved some of the English, no behaviour changes</w:t>
+                </w:r>
+              </w:p>
+            </w:tc>
+          </w:tr>
+          <w:tr>
+            <w:tc>
+              <w:tcPr>
+                <w:tcW w:w="1384" w:type="dxa"/>
+              </w:tcPr>
+              <w:p>
+                <w:pPr>
+                  <w:rPr>
+                    <w:rFonts w:cstheme="minorHAnsi"/>
+                  </w:rPr>
+                </w:pPr>
+                <w:r>
+                  <w:rPr>
+                    <w:rFonts w:cstheme="minorHAnsi"/>
+                  </w:rPr>
+                  <w:t>4 Jul 2026</w:t>
+                </w:r>
+              </w:p>
+            </w:tc>
+            <w:tc>
+              <w:tcPr>
+                <w:tcW w:w="7858" w:type="dxa"/>
+              </w:tcPr>
+              <w:p>
+                <w:pPr>
+                  <w:rPr>
+                    <w:rFonts w:cstheme="minorHAnsi"/>
+                  </w:rPr>
+                </w:pPr>
+                <w:r>
+                  <w:rPr>
+                    <w:rFonts w:cstheme="minorHAnsi"/>
+                  </w:rPr>
+                  <w:t xml:space="preserve">Fixed a typo. Last word of </w:t>
+                </w:r>
+                <w:r>
+                  <w:rPr>
+                    <w:rFonts w:cstheme="minorHAnsi"/>
+                  </w:rPr>
+                  <w:fldChar w:fldCharType="begin"/>
+                </w:r>
+                <w:r>
+                  <w:rPr>
+                    <w:rFonts w:cstheme="minorHAnsi"/>
+                  </w:rPr>
+                  <w:instrText xml:space="preserve"> REF _Ref234067859 \r \h </w:instrText>
+                </w:r>
+                <w:r>
+                  <w:rPr>
+                    <w:rFonts w:cstheme="minorHAnsi"/>
+                  </w:rPr>
+                </w:r>
+                <w:r>
+                  <w:rPr>
+                    <w:rFonts w:cstheme="minorHAnsi"/>
+                  </w:rPr>
+                  <w:fldChar w:fldCharType="separate"/>
+                </w:r>
+                <w:r>
+                  <w:rPr>
+                    <w:rFonts w:cstheme="minorHAnsi"/>
+                  </w:rPr>
+                  <w:t>2.1.1</w:t>
+                </w:r>
+                <w:r>
+                  <w:rPr>
+                    <w:rFonts w:cstheme="minorHAnsi"/>
+                  </w:rPr>
+                  <w:fldChar w:fldCharType="end"/>
+                </w:r>
+                <w:r>
+                  <w:rPr>
+                    <w:rFonts w:cstheme="minorHAnsi"/>
+                  </w:rPr>
+                  <w:t>changed from “low” to “high”</w:t>
+                </w:r>
+              </w:p>
+              <w:p>
+                <w:pPr>
+                  <w:rPr>
+                    <w:rFonts w:cstheme="minorHAnsi"/>
+                  </w:rPr>
+                </w:pPr>
+                <w:r>
+                  <w:rPr>
+                    <w:rFonts w:cstheme="minorHAnsi"/>
+                  </w:rPr>
+                  <w:t>Edit naming of IS to be consistent</w:t>
                 </w:r>
               </w:p>
             </w:tc>
@@ -2160,7 +2252,7 @@
           <w:r>
             <w:fldChar w:fldCharType="separate"/>
           </w:r>
-          <w:hyperlink w:anchor="_Toc234059598" w:history="1">
+          <w:hyperlink w:anchor="_Toc234068063" w:history="1">
             <w:r>
               <w:rPr>
                 <w:rStyle w:val="Hyperlink"/>
@@ -2206,7 +2298,7 @@
                 <w:noProof/>
                 <w:webHidden/>
               </w:rPr>
-              <w:instrText xml:space="preserve"> PAGEREF _Toc234059598 \h </w:instrText>
+              <w:instrText xml:space="preserve"> PAGEREF _Toc234068063 \h </w:instrText>
             </w:r>
             <w:r>
               <w:rPr>
@@ -2250,7 +2342,7 @@
               <w:lang w:eastAsia="en-GB"/>
             </w:rPr>
           </w:pPr>
-          <w:hyperlink w:anchor="_Toc234059599" w:history="1">
+          <w:hyperlink w:anchor="_Toc234068064" w:history="1">
             <w:r>
               <w:rPr>
                 <w:rStyle w:val="Hyperlink"/>
@@ -2294,7 +2386,7 @@
                 <w:noProof/>
                 <w:webHidden/>
               </w:rPr>
-              <w:instrText xml:space="preserve"> PAGEREF _Toc234059599 \h </w:instrText>
+              <w:instrText xml:space="preserve"> PAGEREF _Toc234068064 \h </w:instrText>
             </w:r>
             <w:r>
               <w:rPr>
@@ -2338,7 +2430,7 @@
               <w:lang w:eastAsia="en-GB"/>
             </w:rPr>
           </w:pPr>
-          <w:hyperlink w:anchor="_Toc234059600" w:history="1">
+          <w:hyperlink w:anchor="_Toc234068065" w:history="1">
             <w:r>
               <w:rPr>
                 <w:rStyle w:val="Hyperlink"/>
@@ -2380,7 +2472,7 @@
                 <w:noProof/>
                 <w:webHidden/>
               </w:rPr>
-              <w:instrText xml:space="preserve"> PAGEREF _Toc234059600 \h </w:instrText>
+              <w:instrText xml:space="preserve"> PAGEREF _Toc234068065 \h </w:instrText>
             </w:r>
             <w:r>
               <w:rPr>
@@ -2424,7 +2516,7 @@
               <w:lang w:eastAsia="en-GB"/>
             </w:rPr>
           </w:pPr>
-          <w:hyperlink w:anchor="_Toc234059601" w:history="1">
+          <w:hyperlink w:anchor="_Toc234068066" w:history="1">
             <w:r>
               <w:rPr>
                 <w:rStyle w:val="Hyperlink"/>
@@ -2466,7 +2558,7 @@
                 <w:noProof/>
                 <w:webHidden/>
               </w:rPr>
-              <w:instrText xml:space="preserve"> PAGEREF _Toc234059601 \h </w:instrText>
+              <w:instrText xml:space="preserve"> PAGEREF _Toc234068066 \h </w:instrText>
             </w:r>
             <w:r>
               <w:rPr>
@@ -2510,7 +2602,7 @@
               <w:lang w:eastAsia="en-GB"/>
             </w:rPr>
           </w:pPr>
-          <w:hyperlink w:anchor="_Toc234059602" w:history="1">
+          <w:hyperlink w:anchor="_Toc234068067" w:history="1">
             <w:r>
               <w:rPr>
                 <w:rStyle w:val="Hyperlink"/>
@@ -2552,7 +2644,7 @@
                 <w:noProof/>
                 <w:webHidden/>
               </w:rPr>
-              <w:instrText xml:space="preserve"> PAGEREF _Toc234059602 \h </w:instrText>
+              <w:instrText xml:space="preserve"> PAGEREF _Toc234068067 \h </w:instrText>
             </w:r>
             <w:r>
               <w:rPr>
@@ -2596,7 +2688,7 @@
               <w:lang w:eastAsia="en-GB"/>
             </w:rPr>
           </w:pPr>
-          <w:hyperlink w:anchor="_Toc234059603" w:history="1">
+          <w:hyperlink w:anchor="_Toc234068068" w:history="1">
             <w:r>
               <w:rPr>
                 <w:rStyle w:val="Hyperlink"/>
@@ -2638,7 +2730,7 @@
                 <w:noProof/>
                 <w:webHidden/>
               </w:rPr>
-              <w:instrText xml:space="preserve"> PAGEREF _Toc234059603 \h </w:instrText>
+              <w:instrText xml:space="preserve"> PAGEREF _Toc234068068 \h </w:instrText>
             </w:r>
             <w:r>
               <w:rPr>
@@ -2682,7 +2774,7 @@
               <w:lang w:eastAsia="en-GB"/>
             </w:rPr>
           </w:pPr>
-          <w:hyperlink w:anchor="_Toc234059604" w:history="1">
+          <w:hyperlink w:anchor="_Toc234068069" w:history="1">
             <w:r>
               <w:rPr>
                 <w:rStyle w:val="Hyperlink"/>
@@ -2724,7 +2816,7 @@
                 <w:noProof/>
                 <w:webHidden/>
               </w:rPr>
-              <w:instrText xml:space="preserve"> PAGEREF _Toc234059604 \h </w:instrText>
+              <w:instrText xml:space="preserve"> PAGEREF _Toc234068069 \h </w:instrText>
             </w:r>
             <w:r>
               <w:rPr>
@@ -2768,7 +2860,7 @@
               <w:lang w:eastAsia="en-GB"/>
             </w:rPr>
           </w:pPr>
-          <w:hyperlink w:anchor="_Toc234059605" w:history="1">
+          <w:hyperlink w:anchor="_Toc234068070" w:history="1">
             <w:r>
               <w:rPr>
                 <w:rStyle w:val="Hyperlink"/>
@@ -2812,7 +2904,7 @@
                 <w:noProof/>
                 <w:webHidden/>
               </w:rPr>
-              <w:instrText xml:space="preserve"> PAGEREF _Toc234059605 \h </w:instrText>
+              <w:instrText xml:space="preserve"> PAGEREF _Toc234068070 \h </w:instrText>
             </w:r>
             <w:r>
               <w:rPr>
@@ -2856,7 +2948,7 @@
               <w:lang w:eastAsia="en-GB"/>
             </w:rPr>
           </w:pPr>
-          <w:hyperlink w:anchor="_Toc234059606" w:history="1">
+          <w:hyperlink w:anchor="_Toc234068071" w:history="1">
             <w:r>
               <w:rPr>
                 <w:rStyle w:val="Hyperlink"/>
@@ -2900,7 +2992,7 @@
                 <w:noProof/>
                 <w:webHidden/>
               </w:rPr>
-              <w:instrText xml:space="preserve"> PAGEREF _Toc234059606 \h </w:instrText>
+              <w:instrText xml:space="preserve"> PAGEREF _Toc234068071 \h </w:instrText>
             </w:r>
             <w:r>
               <w:rPr>
@@ -2944,7 +3036,7 @@
               <w:lang w:eastAsia="en-GB"/>
             </w:rPr>
           </w:pPr>
-          <w:hyperlink w:anchor="_Toc234059607" w:history="1">
+          <w:hyperlink w:anchor="_Toc234068072" w:history="1">
             <w:r>
               <w:rPr>
                 <w:rStyle w:val="Hyperlink"/>
@@ -2988,7 +3080,7 @@
                 <w:noProof/>
                 <w:webHidden/>
               </w:rPr>
-              <w:instrText xml:space="preserve"> PAGEREF _Toc234059607 \h </w:instrText>
+              <w:instrText xml:space="preserve"> PAGEREF _Toc234068072 \h </w:instrText>
             </w:r>
             <w:r>
               <w:rPr>
@@ -3032,7 +3124,7 @@
               <w:lang w:eastAsia="en-GB"/>
             </w:rPr>
           </w:pPr>
-          <w:hyperlink w:anchor="_Toc234059608" w:history="1">
+          <w:hyperlink w:anchor="_Toc234068073" w:history="1">
             <w:r>
               <w:rPr>
                 <w:rStyle w:val="Hyperlink"/>
@@ -3076,7 +3168,7 @@
                 <w:noProof/>
                 <w:webHidden/>
               </w:rPr>
-              <w:instrText xml:space="preserve"> PAGEREF _Toc234059608 \h </w:instrText>
+              <w:instrText xml:space="preserve"> PAGEREF _Toc234068073 \h </w:instrText>
             </w:r>
             <w:r>
               <w:rPr>
@@ -3120,7 +3212,7 @@
               <w:lang w:eastAsia="en-GB"/>
             </w:rPr>
           </w:pPr>
-          <w:hyperlink w:anchor="_Toc234059609" w:history="1">
+          <w:hyperlink w:anchor="_Toc234068074" w:history="1">
             <w:r>
               <w:rPr>
                 <w:rStyle w:val="Hyperlink"/>
@@ -3164,7 +3256,7 @@
                 <w:noProof/>
                 <w:webHidden/>
               </w:rPr>
-              <w:instrText xml:space="preserve"> PAGEREF _Toc234059609 \h </w:instrText>
+              <w:instrText xml:space="preserve"> PAGEREF _Toc234068074 \h </w:instrText>
             </w:r>
             <w:r>
               <w:rPr>
@@ -3208,7 +3300,7 @@
               <w:lang w:eastAsia="en-GB"/>
             </w:rPr>
           </w:pPr>
-          <w:hyperlink w:anchor="_Toc234059610" w:history="1">
+          <w:hyperlink w:anchor="_Toc234068075" w:history="1">
             <w:r>
               <w:rPr>
                 <w:rStyle w:val="Hyperlink"/>
@@ -3252,7 +3344,7 @@
                 <w:noProof/>
                 <w:webHidden/>
               </w:rPr>
-              <w:instrText xml:space="preserve"> PAGEREF _Toc234059610 \h </w:instrText>
+              <w:instrText xml:space="preserve"> PAGEREF _Toc234068075 \h </w:instrText>
             </w:r>
             <w:r>
               <w:rPr>
@@ -3296,7 +3388,7 @@
               <w:lang w:eastAsia="en-GB"/>
             </w:rPr>
           </w:pPr>
-          <w:hyperlink w:anchor="_Toc234059611" w:history="1">
+          <w:hyperlink w:anchor="_Toc234068076" w:history="1">
             <w:r>
               <w:rPr>
                 <w:rStyle w:val="Hyperlink"/>
@@ -3340,7 +3432,7 @@
                 <w:noProof/>
                 <w:webHidden/>
               </w:rPr>
-              <w:instrText xml:space="preserve"> PAGEREF _Toc234059611 \h </w:instrText>
+              <w:instrText xml:space="preserve"> PAGEREF _Toc234068076 \h </w:instrText>
             </w:r>
             <w:r>
               <w:rPr>
@@ -3384,7 +3476,7 @@
               <w:lang w:eastAsia="en-GB"/>
             </w:rPr>
           </w:pPr>
-          <w:hyperlink w:anchor="_Toc234059612" w:history="1">
+          <w:hyperlink w:anchor="_Toc234068077" w:history="1">
             <w:r>
               <w:rPr>
                 <w:rStyle w:val="Hyperlink"/>
@@ -3428,7 +3520,7 @@
                 <w:noProof/>
                 <w:webHidden/>
               </w:rPr>
-              <w:instrText xml:space="preserve"> PAGEREF _Toc234059612 \h </w:instrText>
+              <w:instrText xml:space="preserve"> PAGEREF _Toc234068077 \h </w:instrText>
             </w:r>
             <w:r>
               <w:rPr>
@@ -3472,7 +3564,7 @@
               <w:lang w:eastAsia="en-GB"/>
             </w:rPr>
           </w:pPr>
-          <w:hyperlink w:anchor="_Toc234059613" w:history="1">
+          <w:hyperlink w:anchor="_Toc234068078" w:history="1">
             <w:r>
               <w:rPr>
                 <w:rStyle w:val="Hyperlink"/>
@@ -3516,7 +3608,7 @@
                 <w:noProof/>
                 <w:webHidden/>
               </w:rPr>
-              <w:instrText xml:space="preserve"> PAGEREF _Toc234059613 \h </w:instrText>
+              <w:instrText xml:space="preserve"> PAGEREF _Toc234068078 \h </w:instrText>
             </w:r>
             <w:r>
               <w:rPr>
@@ -3560,7 +3652,7 @@
               <w:lang w:eastAsia="en-GB"/>
             </w:rPr>
           </w:pPr>
-          <w:hyperlink w:anchor="_Toc234059614" w:history="1">
+          <w:hyperlink w:anchor="_Toc234068079" w:history="1">
             <w:r>
               <w:rPr>
                 <w:rStyle w:val="Hyperlink"/>
@@ -3604,7 +3696,7 @@
                 <w:noProof/>
                 <w:webHidden/>
               </w:rPr>
-              <w:instrText xml:space="preserve"> PAGEREF _Toc234059614 \h </w:instrText>
+              <w:instrText xml:space="preserve"> PAGEREF _Toc234068079 \h </w:instrText>
             </w:r>
             <w:r>
               <w:rPr>
@@ -3648,7 +3740,7 @@
               <w:lang w:eastAsia="en-GB"/>
             </w:rPr>
           </w:pPr>
-          <w:hyperlink w:anchor="_Toc234059615" w:history="1">
+          <w:hyperlink w:anchor="_Toc234068080" w:history="1">
             <w:r>
               <w:rPr>
                 <w:rStyle w:val="Hyperlink"/>
@@ -3692,7 +3784,7 @@
                 <w:noProof/>
                 <w:webHidden/>
               </w:rPr>
-              <w:instrText xml:space="preserve"> PAGEREF _Toc234059615 \h </w:instrText>
+              <w:instrText xml:space="preserve"> PAGEREF _Toc234068080 \h </w:instrText>
             </w:r>
             <w:r>
               <w:rPr>
@@ -3736,7 +3828,7 @@
               <w:lang w:eastAsia="en-GB"/>
             </w:rPr>
           </w:pPr>
-          <w:hyperlink w:anchor="_Toc234059616" w:history="1">
+          <w:hyperlink w:anchor="_Toc234068081" w:history="1">
             <w:r>
               <w:rPr>
                 <w:rStyle w:val="Hyperlink"/>
@@ -3780,7 +3872,7 @@
                 <w:noProof/>
                 <w:webHidden/>
               </w:rPr>
-              <w:instrText xml:space="preserve"> PAGEREF _Toc234059616 \h </w:instrText>
+              <w:instrText xml:space="preserve"> PAGEREF _Toc234068081 \h </w:instrText>
             </w:r>
             <w:r>
               <w:rPr>
@@ -3824,7 +3916,7 @@
               <w:lang w:eastAsia="en-GB"/>
             </w:rPr>
           </w:pPr>
-          <w:hyperlink w:anchor="_Toc234059617" w:history="1">
+          <w:hyperlink w:anchor="_Toc234068082" w:history="1">
             <w:r>
               <w:rPr>
                 <w:rStyle w:val="Hyperlink"/>
@@ -3868,7 +3960,7 @@
                 <w:noProof/>
                 <w:webHidden/>
               </w:rPr>
-              <w:instrText xml:space="preserve"> PAGEREF _Toc234059617 \h </w:instrText>
+              <w:instrText xml:space="preserve"> PAGEREF _Toc234068082 \h </w:instrText>
             </w:r>
             <w:r>
               <w:rPr>
@@ -3977,7 +4069,7 @@
         </w:rPr>
         <w:fldChar w:fldCharType="separate"/>
       </w:r>
-      <w:hyperlink w:anchor="_Toc234059618" w:history="1">
+      <w:hyperlink w:anchor="_Toc234068083" w:history="1">
         <w:r>
           <w:rPr>
             <w:rStyle w:val="Hyperlink"/>
@@ -4004,7 +4096,7 @@
             <w:noProof/>
             <w:webHidden/>
           </w:rPr>
-          <w:instrText xml:space="preserve"> PAGEREF _Toc234059618 \h </w:instrText>
+          <w:instrText xml:space="preserve"> PAGEREF _Toc234068083 \h </w:instrText>
         </w:r>
         <w:r>
           <w:rPr>
@@ -4047,7 +4139,7 @@
           <w:lang w:eastAsia="en-GB"/>
         </w:rPr>
       </w:pPr>
-      <w:hyperlink w:anchor="_Toc234059619" w:history="1">
+      <w:hyperlink w:anchor="_Toc234068084" w:history="1">
         <w:r>
           <w:rPr>
             <w:rStyle w:val="Hyperlink"/>
@@ -4074,7 +4166,7 @@
             <w:noProof/>
             <w:webHidden/>
           </w:rPr>
-          <w:instrText xml:space="preserve"> PAGEREF _Toc234059619 \h </w:instrText>
+          <w:instrText xml:space="preserve"> PAGEREF _Toc234068084 \h </w:instrText>
         </w:r>
         <w:r>
           <w:rPr>
@@ -4154,7 +4246,7 @@
           <w:lang w:eastAsia="en-GB"/>
         </w:rPr>
       </w:pPr>
-      <w:bookmarkStart w:id="2" w:name="_Toc234059598"/>
+      <w:bookmarkStart w:id="2" w:name="_Toc234068063"/>
       <w:bookmarkEnd w:id="1"/>
       <w:r>
         <w:rPr>
@@ -4177,7 +4269,19 @@
         <w:rPr>
           <w:lang w:eastAsia="en-GB"/>
         </w:rPr>
-        <w:t xml:space="preserve">The purpose of this document is to define how the blocks within the CPU will communicate with each other via the Data Bus and how the Instruction Sequencer (IS) </w:t>
+        <w:t xml:space="preserve">The purpose of this document is to define how the blocks within the CPU will communicate with each other via the Data Bus and how the Instruction </w:t>
+      </w:r>
+      <w:r>
+        <w:rPr>
+          <w:lang w:eastAsia="en-GB"/>
+        </w:rPr>
+        <w:t>Decode &amp; Sequence Control</w:t>
+      </w:r>
+      <w:r>
+        <w:rPr>
+          <w:lang w:eastAsia="en-GB"/>
+        </w:rPr>
+        <w:t xml:space="preserve"> (IS) </w:t>
       </w:r>
       <w:r>
         <w:rPr>
@@ -4205,7 +4309,7 @@
           <w:lang w:eastAsia="en-GB"/>
         </w:rPr>
       </w:pPr>
-      <w:bookmarkStart w:id="3" w:name="_Toc234059599"/>
+      <w:bookmarkStart w:id="3" w:name="_Toc234068064"/>
       <w:r>
         <w:rPr>
           <w:lang w:eastAsia="en-GB"/>
@@ -4346,7 +4450,7 @@
         <w:jc w:val="center"/>
       </w:pPr>
       <w:bookmarkStart w:id="4" w:name="_Ref232073454"/>
-      <w:bookmarkStart w:id="5" w:name="_Toc234059618"/>
+      <w:bookmarkStart w:id="5" w:name="_Toc234068083"/>
       <w:r>
         <w:t xml:space="preserve">Figure </w:t>
       </w:r>
@@ -4766,7 +4870,7 @@
         <w:pStyle w:val="Heading2"/>
       </w:pPr>
       <w:bookmarkStart w:id="6" w:name="_Ref233631401"/>
-      <w:bookmarkStart w:id="7" w:name="_Toc234059600"/>
+      <w:bookmarkStart w:id="7" w:name="_Toc234068065"/>
       <w:r>
         <w:lastRenderedPageBreak/>
         <w:t xml:space="preserve">Overview of </w:t>
@@ -4904,7 +5008,7 @@
         <w:jc w:val="center"/>
       </w:pPr>
       <w:bookmarkStart w:id="8" w:name="_Ref233626426"/>
-      <w:bookmarkStart w:id="9" w:name="_Toc234059619"/>
+      <w:bookmarkStart w:id="9" w:name="_Toc234068084"/>
       <w:r>
         <w:t xml:space="preserve">Figure </w:t>
       </w:r>
@@ -4954,7 +5058,7 @@
         <w:t xml:space="preserve"> </w:t>
       </w:r>
       <w:r>
-        <w:t xml:space="preserve">are provided by the IS (Instruction Decode &amp; Sequence Control) block shown in </w:t>
+        <w:t xml:space="preserve">are provided by the IS block shown in </w:t>
       </w:r>
       <w:r>
         <w:fldChar w:fldCharType="begin"/>
@@ -5199,18 +5303,38 @@
         <w:t xml:space="preserve">ted destination should read from DBUS whilst the data is valid (see </w:t>
       </w:r>
       <w:r>
+        <w:rPr>
+          <w:rFonts w:cstheme="minorHAnsi"/>
+        </w:rPr>
         <w:fldChar w:fldCharType="begin"/>
       </w:r>
       <w:r>
-        <w:instrText xml:space="preserve"> REF _Ref232850548 \r \h </w:instrText>
-      </w:r>
-      <w:r>
+        <w:rPr>
+          <w:rFonts w:cstheme="minorHAnsi"/>
+        </w:rPr>
+        <w:instrText xml:space="preserve"> REF _Ref234067859 \r \h </w:instrText>
+      </w:r>
+      <w:r>
+        <w:rPr>
+          <w:rFonts w:cstheme="minorHAnsi"/>
+        </w:rPr>
+      </w:r>
+      <w:r>
+        <w:rPr>
+          <w:rFonts w:cstheme="minorHAnsi"/>
+        </w:rPr>
         <w:fldChar w:fldCharType="separate"/>
       </w:r>
       <w:r>
+        <w:rPr>
+          <w:rFonts w:cstheme="minorHAnsi"/>
+        </w:rPr>
         <w:t>2.1.1</w:t>
       </w:r>
       <w:r>
+        <w:rPr>
+          <w:rFonts w:cstheme="minorHAnsi"/>
+        </w:rPr>
         <w:fldChar w:fldCharType="end"/>
       </w:r>
       <w:r>
@@ -5292,10 +5416,24 @@
     </w:p>
     <w:p>
       <w:pPr>
+        <w:rPr>
+          <w:rFonts w:asciiTheme="majorHAnsi" w:eastAsiaTheme="majorEastAsia" w:hAnsiTheme="majorHAnsi" w:cstheme="majorBidi"/>
+          <w:b/>
+          <w:bCs/>
+          <w:color w:val="4F81BD" w:themeColor="accent1"/>
+        </w:rPr>
+      </w:pPr>
+      <w:bookmarkStart w:id="10" w:name="_Ref232850548"/>
+      <w:r>
+        <w:br w:type="page"/>
+      </w:r>
+    </w:p>
+    <w:p>
+      <w:pPr>
         <w:pStyle w:val="Heading3"/>
       </w:pPr>
-      <w:bookmarkStart w:id="10" w:name="_Ref232850548"/>
-      <w:bookmarkStart w:id="11" w:name="_Toc234059601"/>
+      <w:bookmarkStart w:id="11" w:name="_Ref234067859"/>
+      <w:bookmarkStart w:id="12" w:name="_Toc234068066"/>
       <w:r>
         <w:lastRenderedPageBreak/>
         <w:t>Reading f</w:t>
@@ -5311,6 +5449,7 @@
       </w:r>
       <w:bookmarkEnd w:id="10"/>
       <w:bookmarkEnd w:id="11"/>
+      <w:bookmarkEnd w:id="12"/>
     </w:p>
     <w:p>
       <w:r>
@@ -5687,25 +5826,25 @@
         <w:rPr>
           <w:lang w:eastAsia="en-GB"/>
         </w:rPr>
-        <w:t xml:space="preserve"> is </w:t>
-      </w:r>
-      <w:r>
-        <w:rPr>
-          <w:lang w:eastAsia="en-GB"/>
-        </w:rPr>
-        <w:t>low</w:t>
-      </w:r>
-      <w:bookmarkStart w:id="12" w:name="_Ref232850585"/>
+        <w:t xml:space="preserve"> is</w:t>
+      </w:r>
+      <w:bookmarkStart w:id="13" w:name="_Ref232850585"/>
+      <w:r>
+        <w:rPr>
+          <w:lang w:eastAsia="en-GB"/>
+        </w:rPr>
+        <w:t xml:space="preserve"> high</w:t>
+      </w:r>
     </w:p>
     <w:p>
       <w:pPr>
         <w:pStyle w:val="Heading3"/>
       </w:pPr>
-      <w:bookmarkStart w:id="13" w:name="_Ref233721017"/>
-      <w:bookmarkStart w:id="14" w:name="_Ref233721180"/>
-      <w:bookmarkStart w:id="15" w:name="_Ref233721252"/>
-      <w:bookmarkStart w:id="16" w:name="_Ref233721322"/>
-      <w:bookmarkStart w:id="17" w:name="_Toc234059602"/>
+      <w:bookmarkStart w:id="14" w:name="_Ref233721017"/>
+      <w:bookmarkStart w:id="15" w:name="_Ref233721180"/>
+      <w:bookmarkStart w:id="16" w:name="_Ref233721252"/>
+      <w:bookmarkStart w:id="17" w:name="_Ref233721322"/>
+      <w:bookmarkStart w:id="18" w:name="_Toc234068067"/>
       <w:r>
         <w:t>Writing t</w:t>
       </w:r>
@@ -5718,12 +5857,12 @@
       <w:r>
         <w:t>Data Bus</w:t>
       </w:r>
-      <w:bookmarkEnd w:id="12"/>
       <w:bookmarkEnd w:id="13"/>
       <w:bookmarkEnd w:id="14"/>
       <w:bookmarkEnd w:id="15"/>
       <w:bookmarkEnd w:id="16"/>
       <w:bookmarkEnd w:id="17"/>
+      <w:bookmarkEnd w:id="18"/>
     </w:p>
     <w:p>
       <w:r>
@@ -6016,13 +6155,13 @@
       <w:pPr>
         <w:pStyle w:val="Heading2"/>
       </w:pPr>
-      <w:bookmarkStart w:id="18" w:name="_Ref232849573"/>
-      <w:bookmarkStart w:id="19" w:name="_Toc234059603"/>
+      <w:bookmarkStart w:id="19" w:name="_Ref232849573"/>
+      <w:bookmarkStart w:id="20" w:name="_Toc234068068"/>
       <w:r>
         <w:t>Overview of GP and SP registers</w:t>
       </w:r>
-      <w:bookmarkEnd w:id="18"/>
       <w:bookmarkEnd w:id="19"/>
+      <w:bookmarkEnd w:id="20"/>
     </w:p>
     <w:p>
       <w:r>
@@ -6044,15 +6183,15 @@
       <w:pPr>
         <w:pStyle w:val="Heading3"/>
       </w:pPr>
-      <w:bookmarkStart w:id="20" w:name="_Ref232926928"/>
-      <w:bookmarkStart w:id="21" w:name="_Ref232926933"/>
-      <w:bookmarkStart w:id="22" w:name="_Toc234059604"/>
+      <w:bookmarkStart w:id="21" w:name="_Ref232926928"/>
+      <w:bookmarkStart w:id="22" w:name="_Ref232926933"/>
+      <w:bookmarkStart w:id="23" w:name="_Toc234068069"/>
       <w:r>
         <w:t>SP Behaviour</w:t>
       </w:r>
-      <w:bookmarkEnd w:id="20"/>
       <w:bookmarkEnd w:id="21"/>
       <w:bookmarkEnd w:id="22"/>
+      <w:bookmarkEnd w:id="23"/>
     </w:p>
     <w:p>
       <w:r>
@@ -6168,15 +6307,15 @@
           <w:lang w:eastAsia="en-GB"/>
         </w:rPr>
       </w:pPr>
-      <w:bookmarkStart w:id="23" w:name="_Ref172648415"/>
-      <w:bookmarkStart w:id="24" w:name="_Toc234059605"/>
+      <w:bookmarkStart w:id="24" w:name="_Ref172648415"/>
+      <w:bookmarkStart w:id="25" w:name="_Toc234068070"/>
       <w:r>
         <w:rPr>
           <w:lang w:eastAsia="en-GB"/>
         </w:rPr>
         <w:t>Other Busses</w:t>
       </w:r>
-      <w:bookmarkEnd w:id="24"/>
+      <w:bookmarkEnd w:id="25"/>
     </w:p>
     <w:p>
       <w:pPr>
@@ -6874,22 +7013,22 @@
           <w:lang w:eastAsia="en-GB"/>
         </w:rPr>
       </w:pPr>
-      <w:bookmarkStart w:id="25" w:name="_Ref232084668"/>
-      <w:bookmarkStart w:id="26" w:name="_Ref232084946"/>
-      <w:bookmarkStart w:id="27" w:name="_Ref232086890"/>
-      <w:bookmarkStart w:id="28" w:name="_Ref232086990"/>
-      <w:bookmarkStart w:id="29" w:name="_Toc234059606"/>
+      <w:bookmarkStart w:id="26" w:name="_Ref232084668"/>
+      <w:bookmarkStart w:id="27" w:name="_Ref232084946"/>
+      <w:bookmarkStart w:id="28" w:name="_Ref232086890"/>
+      <w:bookmarkStart w:id="29" w:name="_Ref232086990"/>
+      <w:bookmarkStart w:id="30" w:name="_Toc234068071"/>
       <w:r>
         <w:rPr>
           <w:lang w:eastAsia="en-GB"/>
         </w:rPr>
         <w:t>Common bus signals</w:t>
       </w:r>
-      <w:bookmarkEnd w:id="25"/>
       <w:bookmarkEnd w:id="26"/>
       <w:bookmarkEnd w:id="27"/>
       <w:bookmarkEnd w:id="28"/>
       <w:bookmarkEnd w:id="29"/>
+      <w:bookmarkEnd w:id="30"/>
     </w:p>
     <w:p>
       <w:pPr>
@@ -7039,16 +7178,16 @@
           <w:lang w:eastAsia="en-GB"/>
         </w:rPr>
       </w:pPr>
-      <w:bookmarkStart w:id="30" w:name="_Ref232081276"/>
-      <w:bookmarkStart w:id="31" w:name="_Toc234059607"/>
+      <w:bookmarkStart w:id="31" w:name="_Ref232081276"/>
+      <w:bookmarkStart w:id="32" w:name="_Toc234068072"/>
       <w:r>
         <w:rPr>
           <w:lang w:eastAsia="en-GB"/>
         </w:rPr>
         <w:t>ADDRESS bus</w:t>
       </w:r>
-      <w:bookmarkEnd w:id="30"/>
       <w:bookmarkEnd w:id="31"/>
+      <w:bookmarkEnd w:id="32"/>
     </w:p>
     <w:p>
       <w:pPr>
@@ -7070,8 +7209,8 @@
           <w:lang w:eastAsia="en-GB"/>
         </w:rPr>
       </w:pPr>
-      <w:bookmarkStart w:id="32" w:name="_Ref232081291"/>
-      <w:bookmarkStart w:id="33" w:name="_Toc234059608"/>
+      <w:bookmarkStart w:id="33" w:name="_Ref232081291"/>
+      <w:bookmarkStart w:id="34" w:name="_Toc234068073"/>
       <w:r>
         <w:rPr>
           <w:lang w:eastAsia="en-GB"/>
@@ -7079,8 +7218,8 @@
         <w:lastRenderedPageBreak/>
         <w:t>OP CODE bus</w:t>
       </w:r>
-      <w:bookmarkEnd w:id="32"/>
       <w:bookmarkEnd w:id="33"/>
+      <w:bookmarkEnd w:id="34"/>
     </w:p>
     <w:p>
       <w:pPr>
@@ -7094,7 +7233,7 @@
         </w:rPr>
         <w:t>This is simply the 16 bit output of the ROM. It’s always enabled and there are no other control signals associated with it.</w:t>
       </w:r>
-      <w:bookmarkStart w:id="34" w:name="_Ref232081293"/>
+      <w:bookmarkStart w:id="35" w:name="_Ref232081293"/>
     </w:p>
     <w:p>
       <w:pPr>
@@ -7103,17 +7242,17 @@
           <w:lang w:eastAsia="en-GB"/>
         </w:rPr>
       </w:pPr>
-      <w:bookmarkStart w:id="35" w:name="_Ref233021496"/>
-      <w:bookmarkStart w:id="36" w:name="_Toc234059609"/>
+      <w:bookmarkStart w:id="36" w:name="_Ref233021496"/>
+      <w:bookmarkStart w:id="37" w:name="_Toc234068074"/>
       <w:r>
         <w:rPr>
           <w:lang w:eastAsia="en-GB"/>
         </w:rPr>
         <w:t>PC CTRL bus</w:t>
       </w:r>
-      <w:bookmarkEnd w:id="34"/>
       <w:bookmarkEnd w:id="35"/>
       <w:bookmarkEnd w:id="36"/>
+      <w:bookmarkEnd w:id="37"/>
     </w:p>
     <w:p>
       <w:pPr>
@@ -7426,36 +7565,36 @@
       </w:r>
       <w:r>
         <w:rPr>
-          <w:lang w:eastAsia="en-GB"/>
+          <w:rFonts w:cstheme="minorHAnsi"/>
         </w:rPr>
         <w:fldChar w:fldCharType="begin"/>
       </w:r>
       <w:r>
         <w:rPr>
-          <w:lang w:eastAsia="en-GB"/>
-        </w:rPr>
-        <w:instrText xml:space="preserve"> REF _Ref232850548 \r \h </w:instrText>
-      </w:r>
-      <w:r>
-        <w:rPr>
-          <w:lang w:eastAsia="en-GB"/>
-        </w:rPr>
-      </w:r>
-      <w:r>
-        <w:rPr>
-          <w:lang w:eastAsia="en-GB"/>
+          <w:rFonts w:cstheme="minorHAnsi"/>
+        </w:rPr>
+        <w:instrText xml:space="preserve"> REF _Ref234067859 \r \h </w:instrText>
+      </w:r>
+      <w:r>
+        <w:rPr>
+          <w:rFonts w:cstheme="minorHAnsi"/>
+        </w:rPr>
+      </w:r>
+      <w:r>
+        <w:rPr>
+          <w:rFonts w:cstheme="minorHAnsi"/>
         </w:rPr>
         <w:fldChar w:fldCharType="separate"/>
       </w:r>
       <w:r>
         <w:rPr>
-          <w:lang w:eastAsia="en-GB"/>
+          <w:rFonts w:cstheme="minorHAnsi"/>
         </w:rPr>
         <w:t>2.1.1</w:t>
       </w:r>
       <w:r>
         <w:rPr>
-          <w:lang w:eastAsia="en-GB"/>
+          <w:rFonts w:cstheme="minorHAnsi"/>
         </w:rPr>
         <w:fldChar w:fldCharType="end"/>
       </w:r>
@@ -7645,7 +7784,7 @@
           <w:lang w:eastAsia="en-GB"/>
         </w:rPr>
       </w:pPr>
-      <w:bookmarkStart w:id="37" w:name="_Ref232081296"/>
+      <w:bookmarkStart w:id="38" w:name="_Ref232081296"/>
       <w:r>
         <w:rPr>
           <w:lang w:eastAsia="en-GB"/>
@@ -7660,8 +7799,8 @@
           <w:lang w:eastAsia="en-GB"/>
         </w:rPr>
       </w:pPr>
-      <w:bookmarkStart w:id="38" w:name="_Ref232090743"/>
-      <w:bookmarkStart w:id="39" w:name="_Toc234059610"/>
+      <w:bookmarkStart w:id="39" w:name="_Ref232090743"/>
+      <w:bookmarkStart w:id="40" w:name="_Toc234068075"/>
       <w:r>
         <w:rPr>
           <w:lang w:eastAsia="en-GB"/>
@@ -7669,9 +7808,9 @@
         <w:lastRenderedPageBreak/>
         <w:t>IO CTRL bus</w:t>
       </w:r>
-      <w:bookmarkEnd w:id="37"/>
       <w:bookmarkEnd w:id="38"/>
       <w:bookmarkEnd w:id="39"/>
+      <w:bookmarkEnd w:id="40"/>
     </w:p>
     <w:p>
       <w:pPr>
@@ -7937,36 +8076,36 @@
       </w:r>
       <w:r>
         <w:rPr>
-          <w:lang w:eastAsia="en-GB"/>
+          <w:rFonts w:cstheme="minorHAnsi"/>
         </w:rPr>
         <w:fldChar w:fldCharType="begin"/>
       </w:r>
       <w:r>
         <w:rPr>
-          <w:lang w:eastAsia="en-GB"/>
-        </w:rPr>
-        <w:instrText xml:space="preserve"> REF _Ref232850548 \r \h </w:instrText>
-      </w:r>
-      <w:r>
-        <w:rPr>
-          <w:lang w:eastAsia="en-GB"/>
-        </w:rPr>
-      </w:r>
-      <w:r>
-        <w:rPr>
-          <w:lang w:eastAsia="en-GB"/>
+          <w:rFonts w:cstheme="minorHAnsi"/>
+        </w:rPr>
+        <w:instrText xml:space="preserve"> REF _Ref234067859 \r \h </w:instrText>
+      </w:r>
+      <w:r>
+        <w:rPr>
+          <w:rFonts w:cstheme="minorHAnsi"/>
+        </w:rPr>
+      </w:r>
+      <w:r>
+        <w:rPr>
+          <w:rFonts w:cstheme="minorHAnsi"/>
         </w:rPr>
         <w:fldChar w:fldCharType="separate"/>
       </w:r>
       <w:r>
         <w:rPr>
-          <w:lang w:eastAsia="en-GB"/>
+          <w:rFonts w:cstheme="minorHAnsi"/>
         </w:rPr>
         <w:t>2.1.1</w:t>
       </w:r>
       <w:r>
         <w:rPr>
-          <w:lang w:eastAsia="en-GB"/>
+          <w:rFonts w:cstheme="minorHAnsi"/>
         </w:rPr>
         <w:fldChar w:fldCharType="end"/>
       </w:r>
@@ -8038,36 +8177,36 @@
       </w:r>
       <w:r>
         <w:rPr>
-          <w:lang w:eastAsia="en-GB"/>
+          <w:rFonts w:cstheme="minorHAnsi"/>
         </w:rPr>
         <w:fldChar w:fldCharType="begin"/>
       </w:r>
       <w:r>
         <w:rPr>
-          <w:lang w:eastAsia="en-GB"/>
-        </w:rPr>
-        <w:instrText xml:space="preserve"> REF _Ref232850548 \r \h </w:instrText>
-      </w:r>
-      <w:r>
-        <w:rPr>
-          <w:lang w:eastAsia="en-GB"/>
-        </w:rPr>
-      </w:r>
-      <w:r>
-        <w:rPr>
-          <w:lang w:eastAsia="en-GB"/>
+          <w:rFonts w:cstheme="minorHAnsi"/>
+        </w:rPr>
+        <w:instrText xml:space="preserve"> REF _Ref234067859 \r \h </w:instrText>
+      </w:r>
+      <w:r>
+        <w:rPr>
+          <w:rFonts w:cstheme="minorHAnsi"/>
+        </w:rPr>
+      </w:r>
+      <w:r>
+        <w:rPr>
+          <w:rFonts w:cstheme="minorHAnsi"/>
         </w:rPr>
         <w:fldChar w:fldCharType="separate"/>
       </w:r>
       <w:r>
         <w:rPr>
-          <w:lang w:eastAsia="en-GB"/>
+          <w:rFonts w:cstheme="minorHAnsi"/>
         </w:rPr>
         <w:t>2.1.1</w:t>
       </w:r>
       <w:r>
         <w:rPr>
-          <w:lang w:eastAsia="en-GB"/>
+          <w:rFonts w:cstheme="minorHAnsi"/>
         </w:rPr>
         <w:fldChar w:fldCharType="end"/>
       </w:r>
@@ -8178,7 +8317,7 @@
         </w:rPr>
         <w:t xml:space="preserve"> for details of how to write to the data bus</w:t>
       </w:r>
-      <w:bookmarkStart w:id="40" w:name="_Ref232081299"/>
+      <w:bookmarkStart w:id="41" w:name="_Ref232081299"/>
     </w:p>
     <w:p>
       <w:pPr>
@@ -8187,17 +8326,17 @@
           <w:lang w:eastAsia="en-GB"/>
         </w:rPr>
       </w:pPr>
-      <w:bookmarkStart w:id="41" w:name="_Ref232090753"/>
-      <w:bookmarkStart w:id="42" w:name="_Toc234059611"/>
+      <w:bookmarkStart w:id="42" w:name="_Ref232090753"/>
+      <w:bookmarkStart w:id="43" w:name="_Toc234068076"/>
       <w:r>
         <w:rPr>
           <w:lang w:eastAsia="en-GB"/>
         </w:rPr>
         <w:t>RAM CTRL bus</w:t>
       </w:r>
-      <w:bookmarkEnd w:id="40"/>
       <w:bookmarkEnd w:id="41"/>
       <w:bookmarkEnd w:id="42"/>
+      <w:bookmarkEnd w:id="43"/>
     </w:p>
     <w:p>
       <w:pPr>
@@ -8392,36 +8531,36 @@
       </w:r>
       <w:r>
         <w:rPr>
-          <w:lang w:eastAsia="en-GB"/>
+          <w:rFonts w:cstheme="minorHAnsi"/>
         </w:rPr>
         <w:fldChar w:fldCharType="begin"/>
       </w:r>
       <w:r>
         <w:rPr>
-          <w:lang w:eastAsia="en-GB"/>
-        </w:rPr>
-        <w:instrText xml:space="preserve"> REF _Ref232850548 \r \h </w:instrText>
-      </w:r>
-      <w:r>
-        <w:rPr>
-          <w:lang w:eastAsia="en-GB"/>
-        </w:rPr>
-      </w:r>
-      <w:r>
-        <w:rPr>
-          <w:lang w:eastAsia="en-GB"/>
+          <w:rFonts w:cstheme="minorHAnsi"/>
+        </w:rPr>
+        <w:instrText xml:space="preserve"> REF _Ref234067859 \r \h </w:instrText>
+      </w:r>
+      <w:r>
+        <w:rPr>
+          <w:rFonts w:cstheme="minorHAnsi"/>
+        </w:rPr>
+      </w:r>
+      <w:r>
+        <w:rPr>
+          <w:rFonts w:cstheme="minorHAnsi"/>
         </w:rPr>
         <w:fldChar w:fldCharType="separate"/>
       </w:r>
       <w:r>
         <w:rPr>
-          <w:lang w:eastAsia="en-GB"/>
+          <w:rFonts w:cstheme="minorHAnsi"/>
         </w:rPr>
         <w:t>2.1.1</w:t>
       </w:r>
       <w:r>
         <w:rPr>
-          <w:lang w:eastAsia="en-GB"/>
+          <w:rFonts w:cstheme="minorHAnsi"/>
         </w:rPr>
         <w:fldChar w:fldCharType="end"/>
       </w:r>
@@ -8564,16 +8703,16 @@
           <w:lang w:eastAsia="en-GB"/>
         </w:rPr>
       </w:pPr>
-      <w:bookmarkStart w:id="43" w:name="_Ref233191365"/>
-      <w:bookmarkStart w:id="44" w:name="_Toc234059612"/>
+      <w:bookmarkStart w:id="44" w:name="_Ref233191365"/>
+      <w:bookmarkStart w:id="45" w:name="_Toc234068077"/>
       <w:r>
         <w:rPr>
           <w:lang w:eastAsia="en-GB"/>
         </w:rPr>
         <w:t>RAM ADDR Bus</w:t>
       </w:r>
-      <w:bookmarkEnd w:id="43"/>
       <w:bookmarkEnd w:id="44"/>
+      <w:bookmarkEnd w:id="45"/>
     </w:p>
     <w:p>
       <w:pPr>
@@ -8671,7 +8810,7 @@
           <w:lang w:eastAsia="en-GB"/>
         </w:rPr>
       </w:pPr>
-      <w:bookmarkStart w:id="45" w:name="_Ref232081305"/>
+      <w:bookmarkStart w:id="46" w:name="_Ref232081305"/>
       <w:r>
         <w:rPr>
           <w:lang w:eastAsia="en-GB"/>
@@ -8686,8 +8825,8 @@
           <w:lang w:eastAsia="en-GB"/>
         </w:rPr>
       </w:pPr>
-      <w:bookmarkStart w:id="46" w:name="_Ref232851000"/>
-      <w:bookmarkStart w:id="47" w:name="_Toc234059613"/>
+      <w:bookmarkStart w:id="47" w:name="_Ref232851000"/>
+      <w:bookmarkStart w:id="48" w:name="_Toc234068078"/>
       <w:r>
         <w:rPr>
           <w:lang w:eastAsia="en-GB"/>
@@ -8695,9 +8834,9 @@
         <w:lastRenderedPageBreak/>
         <w:t>ALU CTRL bus</w:t>
       </w:r>
-      <w:bookmarkEnd w:id="45"/>
       <w:bookmarkEnd w:id="46"/>
       <w:bookmarkEnd w:id="47"/>
+      <w:bookmarkEnd w:id="48"/>
     </w:p>
     <w:p>
       <w:pPr>
@@ -8782,14 +8921,14 @@
           <w:lang w:eastAsia="en-GB"/>
         </w:rPr>
       </w:pPr>
-      <w:bookmarkStart w:id="48" w:name="ALU_MODE"/>
+      <w:bookmarkStart w:id="49" w:name="ALU_MODE"/>
       <w:r>
         <w:rPr>
           <w:lang w:eastAsia="en-GB"/>
         </w:rPr>
         <w:t>ALU_MODE</w:t>
       </w:r>
-      <w:bookmarkEnd w:id="48"/>
+      <w:bookmarkEnd w:id="49"/>
     </w:p>
     <w:p>
       <w:pPr>
@@ -8901,7 +9040,7 @@
         <w:keepNext/>
         <w:jc w:val="center"/>
       </w:pPr>
-      <w:bookmarkStart w:id="49" w:name="_Ref232689048"/>
+      <w:bookmarkStart w:id="50" w:name="_Ref232689048"/>
       <w:r>
         <w:t xml:space="preserve">Table </w:t>
       </w:r>
@@ -8913,7 +9052,7 @@
           <w:t>2</w:t>
         </w:r>
       </w:fldSimple>
-      <w:bookmarkEnd w:id="49"/>
+      <w:bookmarkEnd w:id="50"/>
       <w:r>
         <w:t>:   ALU_MODE bits and their meaning</w:t>
       </w:r>
@@ -10091,14 +10230,14 @@
           <w:lang w:eastAsia="en-GB"/>
         </w:rPr>
       </w:pPr>
-      <w:bookmarkStart w:id="50" w:name="SELECT_ALU_DESTA"/>
+      <w:bookmarkStart w:id="51" w:name="SELECT_ALU_DESTA"/>
       <w:r>
         <w:rPr>
           <w:lang w:eastAsia="en-GB"/>
         </w:rPr>
         <w:t>SELECT_ALU_DESTA</w:t>
       </w:r>
-      <w:bookmarkEnd w:id="50"/>
+      <w:bookmarkEnd w:id="51"/>
     </w:p>
     <w:p>
       <w:pPr>
@@ -10137,36 +10276,36 @@
       </w:r>
       <w:r>
         <w:rPr>
-          <w:lang w:eastAsia="en-GB"/>
+          <w:rFonts w:cstheme="minorHAnsi"/>
         </w:rPr>
         <w:fldChar w:fldCharType="begin"/>
       </w:r>
       <w:r>
         <w:rPr>
-          <w:lang w:eastAsia="en-GB"/>
-        </w:rPr>
-        <w:instrText xml:space="preserve"> REF _Ref232850548 \r \h </w:instrText>
-      </w:r>
-      <w:r>
-        <w:rPr>
-          <w:lang w:eastAsia="en-GB"/>
-        </w:rPr>
-      </w:r>
-      <w:r>
-        <w:rPr>
-          <w:lang w:eastAsia="en-GB"/>
+          <w:rFonts w:cstheme="minorHAnsi"/>
+        </w:rPr>
+        <w:instrText xml:space="preserve"> REF _Ref234067859 \r \h </w:instrText>
+      </w:r>
+      <w:r>
+        <w:rPr>
+          <w:rFonts w:cstheme="minorHAnsi"/>
+        </w:rPr>
+      </w:r>
+      <w:r>
+        <w:rPr>
+          <w:rFonts w:cstheme="minorHAnsi"/>
         </w:rPr>
         <w:fldChar w:fldCharType="separate"/>
       </w:r>
       <w:r>
         <w:rPr>
-          <w:lang w:eastAsia="en-GB"/>
+          <w:rFonts w:cstheme="minorHAnsi"/>
         </w:rPr>
         <w:t>2.1.1</w:t>
       </w:r>
       <w:r>
         <w:rPr>
-          <w:lang w:eastAsia="en-GB"/>
+          <w:rFonts w:cstheme="minorHAnsi"/>
         </w:rPr>
         <w:fldChar w:fldCharType="end"/>
       </w:r>
@@ -10194,14 +10333,14 @@
           <w:lang w:eastAsia="en-GB"/>
         </w:rPr>
       </w:pPr>
-      <w:bookmarkStart w:id="51" w:name="SELECT_ALU_DESTB"/>
+      <w:bookmarkStart w:id="52" w:name="SELECT_ALU_DESTB"/>
       <w:r>
         <w:rPr>
           <w:lang w:eastAsia="en-GB"/>
         </w:rPr>
         <w:t>SELECT_ALU_DESTB</w:t>
       </w:r>
-      <w:bookmarkEnd w:id="51"/>
+      <w:bookmarkEnd w:id="52"/>
     </w:p>
     <w:p>
       <w:pPr>
@@ -10240,44 +10379,50 @@
       </w:r>
       <w:r>
         <w:rPr>
-          <w:lang w:eastAsia="en-GB"/>
+          <w:rFonts w:cstheme="minorHAnsi"/>
         </w:rPr>
         <w:fldChar w:fldCharType="begin"/>
       </w:r>
       <w:r>
         <w:rPr>
-          <w:lang w:eastAsia="en-GB"/>
-        </w:rPr>
-        <w:instrText xml:space="preserve"> REF _Ref232850548 \r \h </w:instrText>
-      </w:r>
-      <w:r>
-        <w:rPr>
-          <w:lang w:eastAsia="en-GB"/>
-        </w:rPr>
-      </w:r>
-      <w:r>
-        <w:rPr>
-          <w:lang w:eastAsia="en-GB"/>
+          <w:rFonts w:cstheme="minorHAnsi"/>
+        </w:rPr>
+        <w:instrText xml:space="preserve"> REF _Ref234067859 \r \h </w:instrText>
+      </w:r>
+      <w:r>
+        <w:rPr>
+          <w:rFonts w:cstheme="minorHAnsi"/>
+        </w:rPr>
+      </w:r>
+      <w:r>
+        <w:rPr>
+          <w:rFonts w:cstheme="minorHAnsi"/>
         </w:rPr>
         <w:fldChar w:fldCharType="separate"/>
       </w:r>
       <w:r>
         <w:rPr>
-          <w:lang w:eastAsia="en-GB"/>
+          <w:rFonts w:cstheme="minorHAnsi"/>
         </w:rPr>
         <w:t>2.1.1</w:t>
       </w:r>
       <w:r>
         <w:rPr>
-          <w:lang w:eastAsia="en-GB"/>
+          <w:rFonts w:cstheme="minorHAnsi"/>
         </w:rPr>
         <w:fldChar w:fldCharType="end"/>
       </w:r>
       <w:r>
         <w:rPr>
-          <w:lang w:eastAsia="en-GB"/>
-        </w:rPr>
-        <w:t xml:space="preserve"> for details of how to read from the data bus</w:t>
+          <w:rFonts w:cstheme="minorHAnsi"/>
+        </w:rPr>
+        <w:t xml:space="preserve"> </w:t>
+      </w:r>
+      <w:r>
+        <w:rPr>
+          <w:lang w:eastAsia="en-GB"/>
+        </w:rPr>
+        <w:t>for details of how to read from the data bus</w:t>
       </w:r>
       <w:r>
         <w:rPr>
@@ -10303,14 +10448,14 @@
           <w:lang w:eastAsia="en-GB"/>
         </w:rPr>
       </w:pPr>
-      <w:bookmarkStart w:id="52" w:name="SELECT_ALUO_SRC"/>
+      <w:bookmarkStart w:id="53" w:name="SELECT_ALUO_SRC"/>
       <w:r>
         <w:rPr>
           <w:lang w:eastAsia="en-GB"/>
         </w:rPr>
         <w:t>SELECT_ALUO_SRC</w:t>
       </w:r>
-      <w:bookmarkEnd w:id="52"/>
+      <w:bookmarkEnd w:id="53"/>
     </w:p>
     <w:p>
       <w:pPr>
@@ -10419,9 +10564,9 @@
           <w:lang w:eastAsia="en-GB"/>
         </w:rPr>
       </w:pPr>
-      <w:bookmarkStart w:id="53" w:name="CurrentEditPos"/>
-      <w:bookmarkStart w:id="54" w:name="_Ref232081310"/>
-      <w:bookmarkEnd w:id="53"/>
+      <w:bookmarkStart w:id="54" w:name="CurrentEditPos"/>
+      <w:bookmarkStart w:id="55" w:name="_Ref232081310"/>
+      <w:bookmarkEnd w:id="54"/>
       <w:r>
         <w:rPr>
           <w:lang w:eastAsia="en-GB"/>
@@ -10436,8 +10581,8 @@
           <w:lang w:eastAsia="en-GB"/>
         </w:rPr>
       </w:pPr>
-      <w:bookmarkStart w:id="55" w:name="_Ref232090831"/>
-      <w:bookmarkStart w:id="56" w:name="_Toc234059614"/>
+      <w:bookmarkStart w:id="56" w:name="_Ref232090831"/>
+      <w:bookmarkStart w:id="57" w:name="_Toc234068079"/>
       <w:r>
         <w:rPr>
           <w:lang w:eastAsia="en-GB"/>
@@ -10445,9 +10590,9 @@
         <w:lastRenderedPageBreak/>
         <w:t>FLAGS bus</w:t>
       </w:r>
-      <w:bookmarkEnd w:id="54"/>
       <w:bookmarkEnd w:id="55"/>
       <w:bookmarkEnd w:id="56"/>
+      <w:bookmarkEnd w:id="57"/>
     </w:p>
     <w:p>
       <w:pPr>
@@ -10795,7 +10940,7 @@
           <w:lang w:eastAsia="en-GB"/>
         </w:rPr>
       </w:pPr>
-      <w:bookmarkStart w:id="57" w:name="_Toc234059615"/>
+      <w:bookmarkStart w:id="58" w:name="_Toc234068080"/>
       <w:r>
         <w:rPr>
           <w:lang w:eastAsia="en-GB"/>
@@ -10831,7 +10976,7 @@
         </w:rPr>
         <w:t>ALU_MODE</w:t>
       </w:r>
-      <w:bookmarkEnd w:id="57"/>
+      <w:bookmarkEnd w:id="58"/>
       <w:r>
         <w:rPr>
           <w:lang w:eastAsia="en-GB"/>
@@ -10966,7 +11111,7 @@
           <w:lang w:eastAsia="en-GB"/>
         </w:rPr>
       </w:pPr>
-      <w:bookmarkStart w:id="58" w:name="_Toc234059616"/>
+      <w:bookmarkStart w:id="59" w:name="_Toc234068081"/>
       <w:r>
         <w:rPr>
           <w:lang w:eastAsia="en-GB"/>
@@ -11002,7 +11147,7 @@
         </w:rPr>
         <w:t>ALU_MODE</w:t>
       </w:r>
-      <w:bookmarkEnd w:id="58"/>
+      <w:bookmarkEnd w:id="59"/>
       <w:r>
         <w:rPr>
           <w:lang w:eastAsia="en-GB"/>
@@ -11157,7 +11302,7 @@
         <w:keepNext/>
         <w:jc w:val="center"/>
       </w:pPr>
-      <w:bookmarkStart w:id="59" w:name="_Ref232694733"/>
+      <w:bookmarkStart w:id="60" w:name="_Ref232694733"/>
       <w:r>
         <w:t xml:space="preserve">Table </w:t>
       </w:r>
@@ -11169,7 +11314,7 @@
           <w:t>3</w:t>
         </w:r>
       </w:fldSimple>
-      <w:bookmarkEnd w:id="59"/>
+      <w:bookmarkEnd w:id="60"/>
       <w:r>
         <w:t xml:space="preserve">:   Rules for FLAG_V and FLAG_C </w:t>
       </w:r>
@@ -12105,7 +12250,7 @@
           <w:lang w:eastAsia="en-GB"/>
         </w:rPr>
       </w:pPr>
-      <w:bookmarkStart w:id="60" w:name="_Ref232694870"/>
+      <w:bookmarkStart w:id="61" w:name="_Ref232694870"/>
       <w:r>
         <w:rPr>
           <w:lang w:eastAsia="en-GB"/>
@@ -12153,7 +12298,7 @@
         </w:rPr>
         <w:t xml:space="preserve"> = ADD</w:t>
       </w:r>
-      <w:bookmarkEnd w:id="60"/>
+      <w:bookmarkEnd w:id="61"/>
     </w:p>
     <w:p>
       <w:pPr>
@@ -12201,7 +12346,7 @@
           <w:lang w:eastAsia="en-GB"/>
         </w:rPr>
       </w:pPr>
-      <w:bookmarkStart w:id="61" w:name="_Ref232694986"/>
+      <w:bookmarkStart w:id="62" w:name="_Ref232694986"/>
       <w:r>
         <w:rPr>
           <w:lang w:eastAsia="en-GB"/>
@@ -12249,7 +12394,7 @@
         </w:rPr>
         <w:t xml:space="preserve"> = ADD</w:t>
       </w:r>
-      <w:bookmarkEnd w:id="61"/>
+      <w:bookmarkEnd w:id="62"/>
     </w:p>
     <w:p>
       <w:pPr>
@@ -12291,7 +12436,7 @@
           <w:lang w:eastAsia="en-GB"/>
         </w:rPr>
       </w:pPr>
-      <w:bookmarkStart w:id="62" w:name="_Ref232695562"/>
+      <w:bookmarkStart w:id="63" w:name="_Ref232695562"/>
       <w:r>
         <w:rPr>
           <w:lang w:eastAsia="en-GB"/>
@@ -12339,7 +12484,7 @@
         </w:rPr>
         <w:t xml:space="preserve"> = SUB</w:t>
       </w:r>
-      <w:bookmarkEnd w:id="62"/>
+      <w:bookmarkEnd w:id="63"/>
     </w:p>
     <w:p>
       <w:pPr>
@@ -12381,7 +12526,7 @@
           <w:lang w:eastAsia="en-GB"/>
         </w:rPr>
       </w:pPr>
-      <w:bookmarkStart w:id="63" w:name="_Ref232695568"/>
+      <w:bookmarkStart w:id="64" w:name="_Ref232695568"/>
       <w:r>
         <w:rPr>
           <w:lang w:eastAsia="en-GB"/>
@@ -12429,7 +12574,7 @@
         </w:rPr>
         <w:t xml:space="preserve"> = SUB</w:t>
       </w:r>
-      <w:bookmarkEnd w:id="63"/>
+      <w:bookmarkEnd w:id="64"/>
     </w:p>
     <w:p>
       <w:pPr>
@@ -12497,7 +12642,7 @@
           <w:lang w:eastAsia="en-GB"/>
         </w:rPr>
       </w:pPr>
-      <w:bookmarkStart w:id="64" w:name="_Toc234059617"/>
+      <w:bookmarkStart w:id="65" w:name="_Toc234068082"/>
       <w:r>
         <w:rPr>
           <w:lang w:eastAsia="en-GB"/>
@@ -12505,10 +12650,10 @@
         <w:lastRenderedPageBreak/>
         <w:t>References</w:t>
       </w:r>
-      <w:bookmarkEnd w:id="23"/>
-      <w:bookmarkEnd w:id="64"/>
-    </w:p>
-    <w:bookmarkStart w:id="65" w:name="AVR_Instruction_Doc"/>
+      <w:bookmarkEnd w:id="24"/>
+      <w:bookmarkEnd w:id="65"/>
+    </w:p>
+    <w:bookmarkStart w:id="66" w:name="AVR_Instruction_Doc"/>
     <w:p>
       <w:pPr>
         <w:pStyle w:val="ListParagraph"/>
@@ -12550,7 +12695,7 @@
         </w:rPr>
         <w:t>AVR Instruction Set Manual</w:t>
       </w:r>
-      <w:bookmarkEnd w:id="65"/>
+      <w:bookmarkEnd w:id="66"/>
       <w:r>
         <w:rPr>
           <w:lang w:eastAsia="en-GB"/>
@@ -12558,7 +12703,7 @@
         <w:fldChar w:fldCharType="end"/>
       </w:r>
     </w:p>
-    <w:bookmarkStart w:id="66" w:name="RefL1SeqXlsx"/>
+    <w:bookmarkStart w:id="67" w:name="RefL1SeqXlsx"/>
     <w:p>
       <w:pPr>
         <w:pStyle w:val="ListParagraph"/>
@@ -12606,7 +12751,7 @@
         </w:rPr>
         <w:fldChar w:fldCharType="end"/>
       </w:r>
-      <w:bookmarkEnd w:id="66"/>
+      <w:bookmarkEnd w:id="67"/>
     </w:p>
     <w:p>
       <w:pPr>
@@ -17225,7 +17370,7 @@
 </file>
 
 <file path=customXml/itemProps2.xml><?xml version="1.0" encoding="utf-8"?>
-<ds:datastoreItem xmlns:ds="http://schemas.openxmlformats.org/officeDocument/2006/customXml" ds:itemID="{952BE7A6-2560-48EC-820E-2F9456F37CE3}">
+<ds:datastoreItem xmlns:ds="http://schemas.openxmlformats.org/officeDocument/2006/customXml" ds:itemID="{F8CB1DC5-1110-48CA-BDA4-592546D462C0}">
   <ds:schemaRefs>
     <ds:schemaRef ds:uri="http://schemas.openxmlformats.org/officeDocument/2006/bibliography"/>
   </ds:schemaRefs>

</xml_diff>

<commit_message>
Fixed description of rising edge in 2.1
Now "low to high" previously "high to low".
</commit_message>
<xml_diff>
--- a/CPU Design/CpuDesign.docx
+++ b/CPU Design/CpuDesign.docx
@@ -63,7 +63,7 @@
                     <v:path arrowok="t"/>
                   </v:shape>
                 </v:group>
-                <v:rect id="_x0000_s1039" style="position:absolute;left:1800;top:1440;width:8638;height:736;mso-width-percent:1000;mso-position-horizontal:center;mso-position-horizontal-relative:margin;mso-position-vertical:top;mso-position-vertical-relative:margin;mso-width-percent:1000;mso-width-relative:margin;mso-height-relative:margin" filled="f" stroked="f">
+                <v:rect id="_x0000_s1039" style="position:absolute;left:1800;top:1440;width:8638;height:551;mso-width-percent:1000;mso-position-horizontal:center;mso-position-horizontal-relative:margin;mso-position-vertical:top;mso-position-vertical-relative:margin;mso-width-percent:1000;mso-width-relative:margin;mso-height-relative:margin" filled="f" stroked="f">
                   <v:textbox style="mso-next-textbox:#_x0000_s1039;mso-fit-shape-to-text:t">
                     <w:txbxContent>
                       <w:p>
@@ -2184,6 +2184,85 @@
               </w:p>
             </w:tc>
           </w:tr>
+          <w:tr>
+            <w:tc>
+              <w:tcPr>
+                <w:tcW w:w="1384" w:type="dxa"/>
+              </w:tcPr>
+              <w:p>
+                <w:pPr>
+                  <w:rPr>
+                    <w:rFonts w:cstheme="minorHAnsi"/>
+                  </w:rPr>
+                </w:pPr>
+                <w:r>
+                  <w:rPr>
+                    <w:rFonts w:cstheme="minorHAnsi"/>
+                  </w:rPr>
+                  <w:t>5 Jul 2026</w:t>
+                </w:r>
+              </w:p>
+            </w:tc>
+            <w:tc>
+              <w:tcPr>
+                <w:tcW w:w="7858" w:type="dxa"/>
+              </w:tcPr>
+              <w:p>
+                <w:pPr>
+                  <w:rPr>
+                    <w:rFonts w:cstheme="minorHAnsi"/>
+                  </w:rPr>
+                </w:pPr>
+                <w:r>
+                  <w:rPr>
+                    <w:rFonts w:cstheme="minorHAnsi"/>
+                  </w:rPr>
+                  <w:t xml:space="preserve">Fixed description of rising edge in </w:t>
+                </w:r>
+                <w:r>
+                  <w:rPr>
+                    <w:rFonts w:cstheme="minorHAnsi"/>
+                  </w:rPr>
+                  <w:fldChar w:fldCharType="begin"/>
+                </w:r>
+                <w:r>
+                  <w:rPr>
+                    <w:rFonts w:cstheme="minorHAnsi"/>
+                  </w:rPr>
+                  <w:instrText xml:space="preserve"> REF _Ref233631401 \r \h </w:instrText>
+                </w:r>
+                <w:r>
+                  <w:rPr>
+                    <w:rFonts w:cstheme="minorHAnsi"/>
+                  </w:rPr>
+                </w:r>
+                <w:r>
+                  <w:rPr>
+                    <w:rFonts w:cstheme="minorHAnsi"/>
+                  </w:rPr>
+                  <w:fldChar w:fldCharType="separate"/>
+                </w:r>
+                <w:r>
+                  <w:rPr>
+                    <w:rFonts w:cstheme="minorHAnsi"/>
+                  </w:rPr>
+                  <w:t>2.1</w:t>
+                </w:r>
+                <w:r>
+                  <w:rPr>
+                    <w:rFonts w:cstheme="minorHAnsi"/>
+                  </w:rPr>
+                  <w:fldChar w:fldCharType="end"/>
+                </w:r>
+                <w:r>
+                  <w:rPr>
+                    <w:rFonts w:cstheme="minorHAnsi"/>
+                  </w:rPr>
+                  <w:t>; now low to high, previously high to low.</w:t>
+                </w:r>
+              </w:p>
+            </w:tc>
+          </w:tr>
         </w:tbl>
         <w:p>
           <w:pPr>
@@ -5132,13 +5211,10 @@
         <w:t xml:space="preserve"> changes from </w:t>
       </w:r>
       <w:r>
-        <w:t>high</w:t>
-      </w:r>
-      <w:r>
-        <w:t xml:space="preserve"> to </w:t>
-      </w:r>
-      <w:r>
         <w:t>low</w:t>
+      </w:r>
+      <w:r>
+        <w:t xml:space="preserve"> high to high</w:t>
       </w:r>
       <w:r>
         <w:t>.</w:t>
@@ -6307,15 +6383,15 @@
           <w:lang w:eastAsia="en-GB"/>
         </w:rPr>
       </w:pPr>
-      <w:bookmarkStart w:id="24" w:name="_Ref172648415"/>
-      <w:bookmarkStart w:id="25" w:name="_Toc234068070"/>
+      <w:bookmarkStart w:id="24" w:name="_Toc234068070"/>
+      <w:bookmarkStart w:id="25" w:name="_Ref172648415"/>
       <w:r>
         <w:rPr>
           <w:lang w:eastAsia="en-GB"/>
         </w:rPr>
         <w:t>Other Busses</w:t>
       </w:r>
-      <w:bookmarkEnd w:id="25"/>
+      <w:bookmarkEnd w:id="24"/>
     </w:p>
     <w:p>
       <w:pPr>
@@ -12650,7 +12726,7 @@
         <w:lastRenderedPageBreak/>
         <w:t>References</w:t>
       </w:r>
-      <w:bookmarkEnd w:id="24"/>
+      <w:bookmarkEnd w:id="25"/>
       <w:bookmarkEnd w:id="65"/>
     </w:p>
     <w:bookmarkStart w:id="66" w:name="AVR_Instruction_Doc"/>
@@ -12681,11 +12757,6 @@
         <w:rPr>
           <w:lang w:eastAsia="en-GB"/>
         </w:rPr>
-      </w:r>
-      <w:r>
-        <w:rPr>
-          <w:lang w:eastAsia="en-GB"/>
-        </w:rPr>
         <w:fldChar w:fldCharType="separate"/>
       </w:r>
       <w:r>
@@ -12726,11 +12797,6 @@
           <w:lang w:eastAsia="en-GB"/>
         </w:rPr>
         <w:instrText>HYPERLINK "C:\\Users\\David\\Dropbox\\WorkArea\\Electronics\\Earth\\GitHubDocs\\Matsuzaka-I-Document\\CPU Design\\L1IsSequences.xlsx"</w:instrText>
-      </w:r>
-      <w:r>
-        <w:rPr>
-          <w:lang w:eastAsia="en-GB"/>
-        </w:rPr>
       </w:r>
       <w:r>
         <w:rPr>
@@ -12877,7 +12943,7 @@
               <w:b/>
               <w:noProof/>
             </w:rPr>
-            <w:t>8</w:t>
+            <w:t>ii</w:t>
           </w:r>
         </w:fldSimple>
       </w:p>
@@ -17370,7 +17436,7 @@
 </file>
 
 <file path=customXml/itemProps2.xml><?xml version="1.0" encoding="utf-8"?>
-<ds:datastoreItem xmlns:ds="http://schemas.openxmlformats.org/officeDocument/2006/customXml" ds:itemID="{F8CB1DC5-1110-48CA-BDA4-592546D462C0}">
+<ds:datastoreItem xmlns:ds="http://schemas.openxmlformats.org/officeDocument/2006/customXml" ds:itemID="{57BE1ABF-D4F8-4AB5-9A98-2ED352FC4F54}">
   <ds:schemaRefs>
     <ds:schemaRef ds:uri="http://schemas.openxmlformats.org/officeDocument/2006/bibliography"/>
   </ds:schemaRefs>

</xml_diff>